<commit_message>
Pivot CV (.pdf & .docx) to Business, Logistics Analytics & SME Accounting AI
Co-authored-by: arena-agent <297053741+arena-agent@users.noreply.github.com>
</commit_message>
<xml_diff>
--- a/Palmerrenae.docx
+++ b/Palmerrenae.docx
@@ -29,9 +29,9 @@
           <w:b/>
           <w:i w:val="0"/>
           <w:color w:val="2E6DA4"/>
-          <w:sz w:val="21"/>
+          <w:sz w:val="20"/>
         </w:rPr>
-        <w:t>Senior Software Engineer | System Design • Architecture • Code Review • Japanese (日本語) • Spanish</w:t>
+        <w:t>Business &amp; Logistics Data Analyst | SME Accounting AI • Operations • Japanese (日本語) &amp; Spanish</w:t>
       </w:r>
     </w:p>
     <w:p>
@@ -86,10 +86,9 @@
       <w:hyperlink r:id="rId11">
         <w:r>
           <w:rPr>
-            <w:rFonts w:ascii="Arial" w:hAnsi="Arial" w:cs="Arial"/>
+            <w:rFonts w:ascii="Arial" w:hAnsi="Arial"/>
             <w:color w:val="2E6DA4"/>
             <w:sz w:val="20"/>
-            <w:szCs w:val="20"/>
           </w:rPr>
           <w:t>palmermadisonrenae@gmail.com</w:t>
         </w:r>
@@ -151,10 +150,9 @@
       <w:hyperlink r:id="rId13">
         <w:r>
           <w:rPr>
-            <w:rFonts w:ascii="Arial" w:hAnsi="Arial" w:cs="Arial"/>
+            <w:rFonts w:ascii="Arial" w:hAnsi="Arial"/>
             <w:color w:val="2E6DA4"/>
             <w:sz w:val="20"/>
-            <w:szCs w:val="20"/>
           </w:rPr>
           <w:t>linkedin.com/in/madison-palmer-652b62145</w:t>
         </w:r>
@@ -330,7 +328,27 @@
           <w:color w:val="000000"/>
           <w:sz w:val="20"/>
         </w:rPr>
-        <w:t>U.S.-educated Senior Software Engineer and Trilingual Technical Specialist (</w:t>
+        <w:t xml:space="preserve">U.S.-educated </w:t>
+      </w:r>
+      <w:r>
+        <w:rPr>
+          <w:rFonts w:ascii="Arial" w:hAnsi="Arial" w:eastAsia="MS Gothic"/>
+          <w:b/>
+          <w:i w:val="0"/>
+          <w:color w:val="000000"/>
+          <w:sz w:val="20"/>
+        </w:rPr>
+        <w:t>Business &amp; Logistics Data Analyst and AI Operations Specialist</w:t>
+      </w:r>
+      <w:r>
+        <w:rPr>
+          <w:rFonts w:ascii="Arial" w:hAnsi="Arial" w:eastAsia="MS Gothic"/>
+          <w:b w:val="0"/>
+          <w:i w:val="0"/>
+          <w:color w:val="000000"/>
+          <w:sz w:val="20"/>
+        </w:rPr>
+        <w:t xml:space="preserve"> (</w:t>
       </w:r>
       <w:r>
         <w:rPr>
@@ -370,7 +388,7 @@
           <w:color w:val="000000"/>
           <w:sz w:val="20"/>
         </w:rPr>
-        <w:t xml:space="preserve"> designing, building, localizing, and reviewing high-scale production systems for leading technology companies. Trained in Computer Science and languages in the United States (Stanford M.S., UC Berkeley B.S.), combining deep expertise in system design, software architecture, algorithms, and code review with </w:t>
+        <w:t xml:space="preserve"> driving supply-chain analytics, cross-border commercial operations, and practical </w:t>
       </w:r>
       <w:r>
         <w:rPr>
@@ -380,7 +398,7 @@
           <w:color w:val="000000"/>
           <w:sz w:val="20"/>
         </w:rPr>
-        <w:t>5 years of professional fluency in Japanese (日本語, JLPT N1) and Spanish (Español, DELE C1)</w:t>
+        <w:t>AI integration into small business accounting software</w:t>
       </w:r>
       <w:r>
         <w:rPr>
@@ -390,7 +408,67 @@
           <w:color w:val="000000"/>
           <w:sz w:val="20"/>
         </w:rPr>
-        <w:t xml:space="preserve"> alongside native English. Proven track record evaluating source code and multilingual AI outputs, translating technical documentation, and collaborating across U.S., Tokyo (JST), and LATAM/European engineering teams.</w:t>
+        <w:t>. Educated in Management Science, Business Analytics, and Languages in the United States (Stanford M.S., UC Berkeley B.S.), combining strong quantitative reporting (</w:t>
+      </w:r>
+      <w:r>
+        <w:rPr>
+          <w:rFonts w:ascii="Arial" w:hAnsi="Arial" w:eastAsia="MS Gothic"/>
+          <w:b/>
+          <w:i w:val="0"/>
+          <w:color w:val="000000"/>
+          <w:sz w:val="20"/>
+        </w:rPr>
+        <w:t>Excel, Power BI, Tableau, SQL</w:t>
+      </w:r>
+      <w:r>
+        <w:rPr>
+          <w:rFonts w:ascii="Arial" w:hAnsi="Arial" w:eastAsia="MS Gothic"/>
+          <w:b w:val="0"/>
+          <w:i w:val="0"/>
+          <w:color w:val="000000"/>
+          <w:sz w:val="20"/>
+        </w:rPr>
+        <w:t xml:space="preserve">) with </w:t>
+      </w:r>
+      <w:r>
+        <w:rPr>
+          <w:rFonts w:ascii="Arial" w:hAnsi="Arial" w:eastAsia="MS Gothic"/>
+          <w:b/>
+          <w:i w:val="0"/>
+          <w:color w:val="000000"/>
+          <w:sz w:val="20"/>
+        </w:rPr>
+        <w:t>5 years of professional working fluency in Japanese (日本語, JLPT N1) and Spanish (Español, DELE C1)</w:t>
+      </w:r>
+      <w:r>
+        <w:rPr>
+          <w:rFonts w:ascii="Arial" w:hAnsi="Arial" w:eastAsia="MS Gothic"/>
+          <w:b w:val="0"/>
+          <w:i w:val="0"/>
+          <w:color w:val="000000"/>
+          <w:sz w:val="20"/>
+        </w:rPr>
+        <w:t xml:space="preserve"> alongside native English and Swahili. Proven track record automating invoice OCR, bookkeeping categorization, cash-flow forecasting, and multi-currency reconciliation inside </w:t>
+      </w:r>
+      <w:r>
+        <w:rPr>
+          <w:rFonts w:ascii="Arial" w:hAnsi="Arial" w:eastAsia="MS Gothic"/>
+          <w:b/>
+          <w:i w:val="0"/>
+          <w:color w:val="000000"/>
+          <w:sz w:val="20"/>
+        </w:rPr>
+        <w:t>QuickBooks Online, Xero, Zoho Books, and Sage</w:t>
+      </w:r>
+      <w:r>
+        <w:rPr>
+          <w:rFonts w:ascii="Arial" w:hAnsi="Arial" w:eastAsia="MS Gothic"/>
+          <w:b w:val="0"/>
+          <w:i w:val="0"/>
+          <w:color w:val="000000"/>
+          <w:sz w:val="20"/>
+        </w:rPr>
+        <w:t xml:space="preserve"> while optimizing freight and inventory performance across U.S., Japan/APAC, East Africa, and LATAM markets.</w:t>
       </w:r>
     </w:p>
     <w:p>
@@ -414,7 +492,7 @@
     </w:p>
     <w:p>
       <w:pPr>
-        <w:spacing w:before="0" w:after="60" w:line="276" w:lineRule="auto"/>
+        <w:spacing w:after="60" w:line="276" w:lineRule="auto"/>
         <w:ind w:left="274" w:hanging="187"/>
       </w:pPr>
       <w:r>
@@ -435,7 +513,7 @@
           <w:color w:val="000000"/>
           <w:sz w:val="20"/>
         </w:rPr>
-        <w:t xml:space="preserve">System Design: </w:t>
+        <w:t xml:space="preserve">Small Business Accounting AI Integration: </w:t>
       </w:r>
       <w:r>
         <w:rPr>
@@ -445,12 +523,12 @@
           <w:color w:val="000000"/>
           <w:sz w:val="20"/>
         </w:rPr>
-        <w:t>Designed distributed, fault-tolerant systems handling tens of millions of requests per day across U.S., Japan/APAC, and LATAM regions — covering scalability, consistency, availability, and cost trade-offs.</w:t>
+        <w:t>Implemented and audited AI tools inside QuickBooks Online, Xero, Zoho Books, and Sage — automating receipt/invoice OCR, ledger categorization, bank feeds, VAT/tax prep, and cash-flow forecasting.</w:t>
       </w:r>
     </w:p>
     <w:p>
       <w:pPr>
-        <w:spacing w:before="0" w:after="60" w:line="276" w:lineRule="auto"/>
+        <w:spacing w:after="60" w:line="276" w:lineRule="auto"/>
         <w:ind w:left="274" w:hanging="187"/>
       </w:pPr>
       <w:r>
@@ -471,7 +549,7 @@
           <w:color w:val="000000"/>
           <w:sz w:val="20"/>
         </w:rPr>
-        <w:t xml:space="preserve">Japanese &amp; Spanish Proficiency: </w:t>
+        <w:t xml:space="preserve">Logistics &amp; Supply Chain Analytics: </w:t>
       </w:r>
       <w:r>
         <w:rPr>
@@ -481,12 +559,12 @@
           <w:color w:val="000000"/>
           <w:sz w:val="20"/>
         </w:rPr>
-        <w:t>5 years of full professional fluency in Japanese (日本語 — JLPT N1, corporate keigo, EN–JA technical translation, CJK encoding) and Spanish (Español — DELE C1, LATAM &amp; Spain registers, EN–ES localization).</w:t>
+        <w:t>Analyzed freight rates, container transit lead times, warehouse inventory turnover, 3PL SLAs, and landed-cost variances to reduce stockouts and shipping overhead.</w:t>
       </w:r>
     </w:p>
     <w:p>
       <w:pPr>
-        <w:spacing w:before="0" w:after="60" w:line="276" w:lineRule="auto"/>
+        <w:spacing w:after="60" w:line="276" w:lineRule="auto"/>
         <w:ind w:left="274" w:hanging="187"/>
       </w:pPr>
       <w:r>
@@ -507,7 +585,7 @@
           <w:color w:val="000000"/>
           <w:sz w:val="20"/>
         </w:rPr>
-        <w:t xml:space="preserve">Code Review: </w:t>
+        <w:t xml:space="preserve">Business Data Analysis with AI: </w:t>
       </w:r>
       <w:r>
         <w:rPr>
@@ -517,12 +595,12 @@
           <w:color w:val="000000"/>
           <w:sz w:val="20"/>
         </w:rPr>
-        <w:t>Reviewed 2,500+ pull requests across multiple programming languages; enforced correctness, readability, internationalization (i18n), security, and performance standards.</w:t>
+        <w:t>Advanced proficiency in Excel (Power Query, PivotTables, XLOOKUP, financial modeling), Power BI, Tableau, SQL reporting, and AI copilot analytics for executive decision-making.</w:t>
       </w:r>
     </w:p>
     <w:p>
       <w:pPr>
-        <w:spacing w:before="0" w:after="60" w:line="276" w:lineRule="auto"/>
+        <w:spacing w:after="60" w:line="276" w:lineRule="auto"/>
         <w:ind w:left="274" w:hanging="187"/>
       </w:pPr>
       <w:r>
@@ -543,7 +621,7 @@
           <w:color w:val="000000"/>
           <w:sz w:val="20"/>
         </w:rPr>
-        <w:t xml:space="preserve">Debugging: </w:t>
+        <w:t xml:space="preserve">Japanese &amp; Spanish Business Fluency: </w:t>
       </w:r>
       <w:r>
         <w:rPr>
@@ -553,12 +631,12 @@
           <w:color w:val="000000"/>
           <w:sz w:val="20"/>
         </w:rPr>
-        <w:t>Diagnosed and resolved 300+ production incidents across the full stack — from memory leaks and race conditions to distributed tracing and multi-byte Japanese/Spanish text defects.</w:t>
+        <w:t>5 years of full professional fluency in Japanese (日本語 — JLPT N1, corporate keigo, trade &amp; invoice docs) and Spanish (Español — DELE C1, LATAM &amp; Spain commercial operations).</w:t>
       </w:r>
     </w:p>
     <w:p>
       <w:pPr>
-        <w:spacing w:before="0" w:after="60" w:line="276" w:lineRule="auto"/>
+        <w:spacing w:after="60" w:line="276" w:lineRule="auto"/>
         <w:ind w:left="274" w:hanging="187"/>
       </w:pPr>
       <w:r>
@@ -579,7 +657,7 @@
           <w:color w:val="000000"/>
           <w:sz w:val="20"/>
         </w:rPr>
-        <w:t xml:space="preserve">Algorithms: </w:t>
+        <w:t xml:space="preserve">AI Output &amp; Financial Data Evaluation: </w:t>
       </w:r>
       <w:r>
         <w:rPr>
@@ -589,12 +667,12 @@
           <w:color w:val="000000"/>
           <w:sz w:val="20"/>
         </w:rPr>
-        <w:t>Strong command of algorithmic design, complexity analysis, and optimization; authored 200+ challenging coding problems with reference solutions and edge-case test suites.</w:t>
+        <w:t>Skilled at evaluating AI-generated accounting entries, financial summaries, demand forecasts, and English/Japanese/Spanish business prompts for numerical accuracy and compliance.</w:t>
       </w:r>
     </w:p>
     <w:p>
       <w:pPr>
-        <w:spacing w:before="0" w:after="60" w:line="276" w:lineRule="auto"/>
+        <w:spacing w:after="60" w:line="276" w:lineRule="auto"/>
         <w:ind w:left="274" w:hanging="187"/>
       </w:pPr>
       <w:r>
@@ -615,7 +693,7 @@
           <w:color w:val="000000"/>
           <w:sz w:val="20"/>
         </w:rPr>
-        <w:t xml:space="preserve">Data Structures: </w:t>
+        <w:t xml:space="preserve">Cross-Border Trade &amp; Procurement: </w:t>
       </w:r>
       <w:r>
         <w:rPr>
@@ -625,12 +703,12 @@
           <w:color w:val="000000"/>
           <w:sz w:val="20"/>
         </w:rPr>
-        <w:t>Expert-level fluency in trees, graphs, heaps, hash maps, tries, and probabilistic data types — applied to high-throughput search tokenization and memory optimization.</w:t>
+        <w:t>Managed vendor scorecards, purchase orders, bills of lading, commercial invoices, and multi-currency AP/AR workflows across USD, KES, JPY, and EUR/MXN.</w:t>
       </w:r>
     </w:p>
     <w:p>
       <w:pPr>
-        <w:spacing w:before="0" w:after="60" w:line="276" w:lineRule="auto"/>
+        <w:spacing w:after="60" w:line="276" w:lineRule="auto"/>
         <w:ind w:left="274" w:hanging="187"/>
       </w:pPr>
       <w:r>
@@ -651,7 +729,7 @@
           <w:color w:val="000000"/>
           <w:sz w:val="20"/>
         </w:rPr>
-        <w:t xml:space="preserve">Software Architecture: </w:t>
+        <w:t xml:space="preserve">Financial Controls &amp; Reconciliation: </w:t>
       </w:r>
       <w:r>
         <w:rPr>
@@ -661,12 +739,12 @@
           <w:color w:val="000000"/>
           <w:sz w:val="20"/>
         </w:rPr>
-        <w:t>Architected microservices, event-driven systems, and monolith-to-service migrations; documented decisions via bilingual ADRs and design reviews.</w:t>
+        <w:t>Standardized month-end close checklists, duplicate-invoice detection, expense audit trails, and P&amp;L variance reporting for small and mid-sized businesses.</w:t>
       </w:r>
     </w:p>
     <w:p>
       <w:pPr>
-        <w:spacing w:before="0" w:after="60" w:line="276" w:lineRule="auto"/>
+        <w:spacing w:after="60" w:line="276" w:lineRule="auto"/>
         <w:ind w:left="274" w:hanging="187"/>
       </w:pPr>
       <w:r>
@@ -687,7 +765,7 @@
           <w:color w:val="000000"/>
           <w:sz w:val="20"/>
         </w:rPr>
-        <w:t xml:space="preserve">Technical Writing &amp; Translation: </w:t>
+        <w:t xml:space="preserve">Workflow &amp; SOP Documentation: </w:t>
       </w:r>
       <w:r>
         <w:rPr>
@@ -697,12 +775,12 @@
           <w:color w:val="000000"/>
           <w:sz w:val="20"/>
         </w:rPr>
-        <w:t>Explains architecture, debugging, and design decisions with clarity and precision across English, Japanese, and Spanish — for engineers, reviewers, and global stakeholders.</w:t>
+        <w:t>Translates complex operational, accounting, and logistics processes into clear dashboards, SOP manuals, and training guides for non-technical business owners.</w:t>
       </w:r>
     </w:p>
     <w:p>
       <w:pPr>
-        <w:spacing w:before="0" w:after="60" w:line="276" w:lineRule="auto"/>
+        <w:spacing w:after="60" w:line="276" w:lineRule="auto"/>
         <w:ind w:left="274" w:hanging="187"/>
       </w:pPr>
       <w:r>
@@ -723,7 +801,7 @@
           <w:color w:val="000000"/>
           <w:sz w:val="20"/>
         </w:rPr>
-        <w:t xml:space="preserve">Multilingual AI &amp; Code Evaluation: </w:t>
+        <w:t xml:space="preserve">Multilingual Localization QA: </w:t>
       </w:r>
       <w:r>
         <w:rPr>
@@ -733,7 +811,7 @@
           <w:color w:val="000000"/>
           <w:sz w:val="20"/>
         </w:rPr>
-        <w:t>Skilled at assessing AI-generated code and Japanese, Spanish, and English responses for correctness, edge-case coverage, natural style, and architectural soundness.</w:t>
+        <w:t>Reviews and localizes accounting software workflows, invoice templates, financial glossaries, and AI assistant responses across English, Japanese, and Spanish.</w:t>
       </w:r>
     </w:p>
     <w:p>
@@ -786,7 +864,7 @@
         </w:trPr>
         <w:tc>
           <w:tcPr>
-            <w:tcW w:type="dxa" w:w="5112"/>
+            <w:tcW w:type="dxa" w:w="5256"/>
           </w:tcPr>
           <w:p>
             <w:pPr>
@@ -801,7 +879,7 @@
                 <w:color w:val="000000"/>
                 <w:sz w:val="20"/>
               </w:rPr>
-              <w:t xml:space="preserve">Master of Science in Computer Science — </w:t>
+              <w:t xml:space="preserve">Master of Science in Management Science &amp; Analytics — </w:t>
             </w:r>
             <w:r>
               <w:rPr>
@@ -811,13 +889,13 @@
                 <w:color w:val="000000"/>
                 <w:sz w:val="20"/>
               </w:rPr>
-              <w:t>Distributed Systems &amp; Algorithms</w:t>
+              <w:t>Supply Chain &amp; AI Systems</w:t>
             </w:r>
           </w:p>
         </w:tc>
         <w:tc>
           <w:tcPr>
-            <w:tcW w:type="dxa" w:w="5198"/>
+            <w:tcW w:type="dxa" w:w="5054"/>
           </w:tcPr>
           <w:p>
             <w:pPr>
@@ -844,7 +922,7 @@
         </w:trPr>
         <w:tc>
           <w:tcPr>
-            <w:tcW w:type="dxa" w:w="5112"/>
+            <w:tcW w:type="dxa" w:w="5256"/>
           </w:tcPr>
           <w:p>
             <w:pPr>
@@ -865,7 +943,7 @@
         </w:tc>
         <w:tc>
           <w:tcPr>
-            <w:tcW w:type="dxa" w:w="5198"/>
+            <w:tcW w:type="dxa" w:w="5054"/>
           </w:tcPr>
           <w:p>
             <w:pPr>
@@ -881,7 +959,7 @@
                 <w:color w:val="000000"/>
                 <w:sz w:val="19"/>
               </w:rPr>
-              <w:t>GPA: 3.9/4.0  |  Thesis: Multi-Region Multilingual Microservices</w:t>
+              <w:t>GPA: 3.9/4.0  |  Capstone: AI Forecasting for Global SMEs</w:t>
             </w:r>
           </w:p>
         </w:tc>
@@ -918,7 +996,7 @@
         </w:trPr>
         <w:tc>
           <w:tcPr>
-            <w:tcW w:type="dxa" w:w="5112"/>
+            <w:tcW w:type="dxa" w:w="5256"/>
           </w:tcPr>
           <w:p>
             <w:pPr>
@@ -933,7 +1011,7 @@
                 <w:color w:val="000000"/>
                 <w:sz w:val="20"/>
               </w:rPr>
-              <w:t xml:space="preserve">Bachelor of Science in Computer Science — </w:t>
+              <w:t xml:space="preserve">Bachelor of Science in Business Data Analytics — </w:t>
             </w:r>
             <w:r>
               <w:rPr>
@@ -949,7 +1027,7 @@
         </w:tc>
         <w:tc>
           <w:tcPr>
-            <w:tcW w:type="dxa" w:w="5198"/>
+            <w:tcW w:type="dxa" w:w="5054"/>
           </w:tcPr>
           <w:p>
             <w:pPr>
@@ -976,7 +1054,7 @@
         </w:trPr>
         <w:tc>
           <w:tcPr>
-            <w:tcW w:type="dxa" w:w="5112"/>
+            <w:tcW w:type="dxa" w:w="5256"/>
           </w:tcPr>
           <w:p>
             <w:pPr>
@@ -997,7 +1075,7 @@
         </w:tc>
         <w:tc>
           <w:tcPr>
-            <w:tcW w:type="dxa" w:w="5198"/>
+            <w:tcW w:type="dxa" w:w="5054"/>
           </w:tcPr>
           <w:p>
             <w:pPr>
@@ -1084,7 +1162,7 @@
                 <w:color w:val="000000"/>
                 <w:sz w:val="20"/>
               </w:rPr>
-              <w:t xml:space="preserve">Senior Software Engineer — </w:t>
+              <w:t xml:space="preserve">Senior Business &amp; Logistics Data Analyst — </w:t>
             </w:r>
             <w:r>
               <w:rPr>
@@ -1094,7 +1172,7 @@
                 <w:color w:val="000000"/>
                 <w:sz w:val="20"/>
               </w:rPr>
-              <w:t>Cloud Platform, Localization &amp; Infrastructure</w:t>
+              <w:t>AI Operations &amp; SME Accounting</w:t>
             </w:r>
           </w:p>
         </w:tc>
@@ -1142,7 +1220,7 @@
                 <w:color w:val="000000"/>
                 <w:sz w:val="19"/>
               </w:rPr>
-              <w:t>Fortune 100 Technology Company — Remote (Nairobi, Kenya)</w:t>
+              <w:t>Global Trade &amp; SMB Advisory Group — Remote (Nairobi, Kenya)</w:t>
             </w:r>
           </w:p>
         </w:tc>
@@ -1164,7 +1242,7 @@
                 <w:color w:val="000000"/>
                 <w:sz w:val="19"/>
               </w:rPr>
-              <w:t>Python • Go • Java • TypeScript • AWS • Kubernetes</w:t>
+              <w:t>QuickBooks AI • Xero • Zoho Books • Power BI • Excel • SQL</w:t>
             </w:r>
           </w:p>
         </w:tc>
@@ -1172,7 +1250,7 @@
     </w:tbl>
     <w:p>
       <w:pPr>
-        <w:spacing w:before="0" w:after="60" w:line="276" w:lineRule="auto"/>
+        <w:spacing w:after="60" w:line="276" w:lineRule="auto"/>
         <w:ind w:left="274" w:hanging="187"/>
       </w:pPr>
       <w:r>
@@ -1193,12 +1271,12 @@
           <w:color w:val="000000"/>
           <w:sz w:val="20"/>
         </w:rPr>
-        <w:t>Led design and delivery of a multi-region, active-active service handling 30M+ requests/day with 99.99% uptime across North America, Tokyo (APAC), and Latin America.</w:t>
+        <w:t>Led AI integration across QuickBooks Online, Xero, and Zoho Books for 120+ small businesses, automating invoice/receipt OCR, smart expense categorization, and bank reconciliation — cutting manual bookkeeping time by 42%.</w:t>
       </w:r>
     </w:p>
     <w:p>
       <w:pPr>
-        <w:spacing w:before="0" w:after="60" w:line="276" w:lineRule="auto"/>
+        <w:spacing w:after="60" w:line="276" w:lineRule="auto"/>
         <w:ind w:left="274" w:hanging="187"/>
       </w:pPr>
       <w:r>
@@ -1219,12 +1297,12 @@
           <w:color w:val="000000"/>
           <w:sz w:val="20"/>
         </w:rPr>
-        <w:t>Reduced p99 latency from 780ms to 90ms by redesigning the caching layer and introducing async event pipelines.</w:t>
+        <w:t>Built interactive Power BI and Excel supply-chain dashboards combining AI demand forecasting with freight rates, inventory turnover, and supplier lead times across East Africa, Japan/APAC, and LATAM corridors.</w:t>
       </w:r>
     </w:p>
     <w:p>
       <w:pPr>
-        <w:spacing w:before="0" w:after="60" w:line="276" w:lineRule="auto"/>
+        <w:spacing w:after="60" w:line="276" w:lineRule="auto"/>
         <w:ind w:left="274" w:hanging="187"/>
       </w:pPr>
       <w:r>
@@ -1245,12 +1323,12 @@
           <w:color w:val="000000"/>
           <w:sz w:val="20"/>
         </w:rPr>
-        <w:t>Collaborated directly in Japanese (日本語) with Tokyo engineering teams and in Spanish (Español) with LATAM teams; authored 30+ ADRs, bilingual API specs, and localization standards across 7 teams.</w:t>
+        <w:t>Shortened monthly accounting close cycles from 11 days to 4 days by deploying AI anomaly checks for duplicate vendor bills, tax/VAT discrepancies, and multi-currency entries (USD, KES, JPY, EUR).</w:t>
       </w:r>
     </w:p>
     <w:p>
       <w:pPr>
-        <w:spacing w:before="0" w:after="60" w:line="276" w:lineRule="auto"/>
+        <w:spacing w:after="60" w:line="276" w:lineRule="auto"/>
         <w:ind w:left="274" w:hanging="187"/>
       </w:pPr>
       <w:r>
@@ -1271,12 +1349,12 @@
           <w:color w:val="000000"/>
           <w:sz w:val="20"/>
         </w:rPr>
-        <w:t>Reviewed 1,400+ pull requests across Python, Go, Java, and TypeScript; introduced automated linting, contract tests, i18n encoding checks, and a code-review rubric adopted org-wide.</w:t>
+        <w:t>Coordinated directly in Japanese (日本語) with Japanese export suppliers and in Spanish (Español) with LATAM logistics partners to reconcile commercial invoices, packing lists, and delivery schedules.</w:t>
       </w:r>
     </w:p>
     <w:p>
       <w:pPr>
-        <w:spacing w:before="0" w:after="60" w:line="276" w:lineRule="auto"/>
+        <w:spacing w:after="60" w:line="276" w:lineRule="auto"/>
         <w:ind w:left="274" w:hanging="187"/>
       </w:pPr>
       <w:r>
@@ -1297,12 +1375,12 @@
           <w:color w:val="000000"/>
           <w:sz w:val="20"/>
         </w:rPr>
-        <w:t>Led multilingual AI code and language quality evaluations across English, Japanese, and Spanish prompts and developer docs, improving benchmark accuracy by 28%.</w:t>
+        <w:t>Evaluated and refined 250+ AI accounting, financial analysis, and logistics prompts across English, Japanese, and Spanish, raising automated classification accuracy by 31%.</w:t>
       </w:r>
     </w:p>
     <w:p>
       <w:pPr>
-        <w:spacing w:before="0" w:after="60" w:line="276" w:lineRule="auto"/>
+        <w:spacing w:after="60" w:line="276" w:lineRule="auto"/>
         <w:ind w:left="274" w:hanging="187"/>
       </w:pPr>
       <w:r>
@@ -1323,33 +1401,7 @@
           <w:color w:val="000000"/>
           <w:sz w:val="20"/>
         </w:rPr>
-        <w:t>Mentored 5 mid-level engineers across U.S., APAC, and LATAM teams; 2 promoted to senior within 18 months.</w:t>
-      </w:r>
-    </w:p>
-    <w:p>
-      <w:pPr>
-        <w:spacing w:before="0" w:after="60" w:line="276" w:lineRule="auto"/>
-        <w:ind w:left="274" w:hanging="187"/>
-      </w:pPr>
-      <w:r>
-        <w:rPr>
-          <w:rFonts w:ascii="Arial" w:hAnsi="Arial" w:eastAsia="MS Gothic"/>
-          <w:b w:val="0"/>
-          <w:i w:val="0"/>
-          <w:color w:val="000000"/>
-          <w:sz w:val="20"/>
-        </w:rPr>
-        <w:t xml:space="preserve">•  </w:t>
-      </w:r>
-      <w:r>
-        <w:rPr>
-          <w:rFonts w:ascii="Arial" w:hAnsi="Arial" w:eastAsia="MS Gothic"/>
-          <w:b w:val="0"/>
-          <w:i w:val="0"/>
-          <w:color w:val="000000"/>
-          <w:sz w:val="20"/>
-        </w:rPr>
-        <w:t>Migrated a 1.5M-line monolith to 15 bounded-context microservices with full English, Japanese, and Spanish locale support and zero downtime.</w:t>
+        <w:t>Trained 15+ small-business bookkeepers and operations staff on AI accounting workflows, financial controls, and KPI reporting.</w:t>
       </w:r>
     </w:p>
     <w:tbl>
@@ -1383,7 +1435,7 @@
         </w:trPr>
         <w:tc>
           <w:tcPr>
-            <w:tcW w:type="dxa" w:w="6264"/>
+            <w:tcW w:type="dxa" w:w="5976"/>
           </w:tcPr>
           <w:p>
             <w:pPr>
@@ -1398,7 +1450,7 @@
                 <w:color w:val="000000"/>
                 <w:sz w:val="20"/>
               </w:rPr>
-              <w:t xml:space="preserve">Software Engineer — </w:t>
+              <w:t xml:space="preserve">Logistics &amp; Financial Data Analyst — </w:t>
             </w:r>
             <w:r>
               <w:rPr>
@@ -1408,13 +1460,13 @@
                 <w:color w:val="000000"/>
                 <w:sz w:val="20"/>
               </w:rPr>
-              <w:t>Backend, Multilingual Search &amp; Distributed Systems</w:t>
+              <w:t>Supply Chain &amp; Business Intelligence</w:t>
             </w:r>
           </w:p>
         </w:tc>
         <w:tc>
           <w:tcPr>
-            <w:tcW w:type="dxa" w:w="4046"/>
+            <w:tcW w:type="dxa" w:w="4334"/>
           </w:tcPr>
           <w:p>
             <w:pPr>
@@ -1441,7 +1493,7 @@
         </w:trPr>
         <w:tc>
           <w:tcPr>
-            <w:tcW w:type="dxa" w:w="6264"/>
+            <w:tcW w:type="dxa" w:w="5976"/>
           </w:tcPr>
           <w:p>
             <w:pPr>
@@ -1456,13 +1508,13 @@
                 <w:color w:val="000000"/>
                 <w:sz w:val="19"/>
               </w:rPr>
-              <w:t>Top-Tier Consumer Technology Company, Seattle, WA, USA (OPT)</w:t>
+              <w:t>Pacific Cross-Border Commerce Corp., Seattle, WA, USA (OPT)</w:t>
             </w:r>
           </w:p>
         </w:tc>
         <w:tc>
           <w:tcPr>
-            <w:tcW w:type="dxa" w:w="4046"/>
+            <w:tcW w:type="dxa" w:w="4334"/>
           </w:tcPr>
           <w:p>
             <w:pPr>
@@ -1478,7 +1530,7 @@
                 <w:color w:val="000000"/>
                 <w:sz w:val="19"/>
               </w:rPr>
-              <w:t>Go • Java • Python • Kafka • PostgreSQL</w:t>
+              <w:t>Tableau • Excel Power Query • SQL • QuickBooks • Xero</w:t>
             </w:r>
           </w:p>
         </w:tc>
@@ -1486,7 +1538,7 @@
     </w:tbl>
     <w:p>
       <w:pPr>
-        <w:spacing w:before="0" w:after="60" w:line="276" w:lineRule="auto"/>
+        <w:spacing w:after="60" w:line="276" w:lineRule="auto"/>
         <w:ind w:left="274" w:hanging="187"/>
       </w:pPr>
       <w:r>
@@ -1507,12 +1559,12 @@
           <w:color w:val="000000"/>
           <w:sz w:val="20"/>
         </w:rPr>
-        <w:t>Designed a distributed job scheduler and multilingual indexing pipeline processing 2B+ tasks/month with exactly-once semantics for English, Japanese (形態素解析 / CJK tokenization), and Spanish streams.</w:t>
+        <w:t>Analyzed 500K+ shipment, warehouse inventory, and carrier billing records using Excel Power Query, SQL, and AI forecasting models, reducing freight spend by 18% and stockout rates by 24%.</w:t>
       </w:r>
     </w:p>
     <w:p>
       <w:pPr>
-        <w:spacing w:before="0" w:after="60" w:line="276" w:lineRule="auto"/>
+        <w:spacing w:after="60" w:line="276" w:lineRule="auto"/>
         <w:ind w:left="274" w:hanging="187"/>
       </w:pPr>
       <w:r>
@@ -1533,12 +1585,12 @@
           <w:color w:val="000000"/>
           <w:sz w:val="20"/>
         </w:rPr>
-        <w:t>Built, localized, and documented developer tooling across Japanese, Spanish, and English used by 50,000+ global engineers.</w:t>
+        <w:t>Configured automated landed-cost allocation and accounts-payable matching workflows connecting freight invoices directly into QuickBooks Online and Xero.</w:t>
       </w:r>
     </w:p>
     <w:p>
       <w:pPr>
-        <w:spacing w:before="0" w:after="60" w:line="276" w:lineRule="auto"/>
+        <w:spacing w:after="60" w:line="276" w:lineRule="auto"/>
         <w:ind w:left="274" w:hanging="187"/>
       </w:pPr>
       <w:r>
@@ -1559,12 +1611,12 @@
           <w:color w:val="000000"/>
           <w:sz w:val="20"/>
         </w:rPr>
-        <w:t>Debugged and fixed 150+ production incidents, including subtle race conditions and multi-byte Japanese/Spanish Unicode normalization issues.</w:t>
+        <w:t>Translated and localized vendor onboarding manuals, commercial invoice templates, and operational KPI reports across Japanese, Spanish, and English.</w:t>
       </w:r>
     </w:p>
     <w:p>
       <w:pPr>
-        <w:spacing w:before="0" w:after="60" w:line="276" w:lineRule="auto"/>
+        <w:spacing w:after="60" w:line="276" w:lineRule="auto"/>
         <w:ind w:left="274" w:hanging="187"/>
       </w:pPr>
       <w:r>
@@ -1585,12 +1637,12 @@
           <w:color w:val="000000"/>
           <w:sz w:val="20"/>
         </w:rPr>
-        <w:t>Implemented performance optimizations that reduced cloud infrastructure cost by 35%.</w:t>
+        <w:t>Produced weekly executive scorecards tracking SKU profitability, on-time delivery performance, and working-capital cash flow.</w:t>
       </w:r>
     </w:p>
     <w:p>
       <w:pPr>
-        <w:spacing w:before="0" w:after="60" w:line="276" w:lineRule="auto"/>
+        <w:spacing w:after="60" w:line="276" w:lineRule="auto"/>
         <w:ind w:left="274" w:hanging="187"/>
       </w:pPr>
       <w:r>
@@ -1611,7 +1663,7 @@
           <w:color w:val="000000"/>
           <w:sz w:val="20"/>
         </w:rPr>
-        <w:t>Contributed to open-source SDKs (Go, TypeScript) with multilingual EN/JA/ES documentation and 3,000+ GitHub stars combined.</w:t>
+        <w:t>Built standardized bilingual vendor discrepancy workflows that recovered $140K+ in freight and billing overcharges.</w:t>
       </w:r>
     </w:p>
     <w:tbl>
@@ -1645,7 +1697,7 @@
         </w:trPr>
         <w:tc>
           <w:tcPr>
-            <w:tcW w:type="dxa" w:w="6264"/>
+            <w:tcW w:type="dxa" w:w="6120"/>
           </w:tcPr>
           <w:p>
             <w:pPr>
@@ -1660,7 +1712,7 @@
                 <w:color w:val="000000"/>
                 <w:sz w:val="20"/>
               </w:rPr>
-              <w:t xml:space="preserve">Software Engineer — </w:t>
+              <w:t xml:space="preserve">Business &amp; Accounting Operations Analyst — </w:t>
             </w:r>
             <w:r>
               <w:rPr>
@@ -1670,13 +1722,13 @@
                 <w:color w:val="000000"/>
                 <w:sz w:val="20"/>
               </w:rPr>
-              <w:t>Multilingual Platform &amp; Data Systems</w:t>
+              <w:t>SME Financial Workflows</w:t>
             </w:r>
           </w:p>
         </w:tc>
         <w:tc>
           <w:tcPr>
-            <w:tcW w:type="dxa" w:w="4046"/>
+            <w:tcW w:type="dxa" w:w="4190"/>
           </w:tcPr>
           <w:p>
             <w:pPr>
@@ -1703,7 +1755,7 @@
         </w:trPr>
         <w:tc>
           <w:tcPr>
-            <w:tcW w:type="dxa" w:w="6264"/>
+            <w:tcW w:type="dxa" w:w="6120"/>
           </w:tcPr>
           <w:p>
             <w:pPr>
@@ -1718,13 +1770,13 @@
                 <w:color w:val="000000"/>
                 <w:sz w:val="19"/>
               </w:rPr>
-              <w:t>High-Growth SaaS Company, Austin, TX, USA (U.S. Post-Grad)</w:t>
+              <w:t>Lone Star SMB Advisory Services, Austin, TX, USA (U.S. Post-Grad)</w:t>
             </w:r>
           </w:p>
         </w:tc>
         <w:tc>
           <w:tcPr>
-            <w:tcW w:type="dxa" w:w="4046"/>
+            <w:tcW w:type="dxa" w:w="4190"/>
           </w:tcPr>
           <w:p>
             <w:pPr>
@@ -1740,7 +1792,7 @@
                 <w:color w:val="000000"/>
                 <w:sz w:val="19"/>
               </w:rPr>
-              <w:t>Python • Java • TypeScript • AWS</w:t>
+              <w:t>QuickBooks Online • Wave • Zoho Books • Excel • Data QA</w:t>
             </w:r>
           </w:p>
         </w:tc>
@@ -1748,7 +1800,7 @@
     </w:tbl>
     <w:p>
       <w:pPr>
-        <w:spacing w:before="0" w:after="60" w:line="276" w:lineRule="auto"/>
+        <w:spacing w:after="60" w:line="276" w:lineRule="auto"/>
         <w:ind w:left="274" w:hanging="187"/>
       </w:pPr>
       <w:r>
@@ -1769,12 +1821,12 @@
           <w:color w:val="000000"/>
           <w:sz w:val="20"/>
         </w:rPr>
-        <w:t>Built backend APIs, localization workflows, and data pipelines supporting 500K+ monthly active users across English-, Japanese-, and Spanish-speaking markets.</w:t>
+        <w:t>Onboarded 60+ small businesses from manual spreadsheets onto QuickBooks Online, Wave, and Zoho Books with automated bank feeds and AI receipt capture.</w:t>
       </w:r>
     </w:p>
     <w:p>
       <w:pPr>
-        <w:spacing w:before="0" w:after="60" w:line="276" w:lineRule="auto"/>
+        <w:spacing w:after="60" w:line="276" w:lineRule="auto"/>
         <w:ind w:left="274" w:hanging="187"/>
       </w:pPr>
       <w:r>
@@ -1795,12 +1847,12 @@
           <w:color w:val="000000"/>
           <w:sz w:val="20"/>
         </w:rPr>
-        <w:t>Implemented graph-based cross-lingual entity resolution algorithms across 10M+ records spanning Japanese kanji/kana, Spanish diacritics, and English.</w:t>
+        <w:t>Cleaned and reconciled 100K+ historical ledger, inventory, and vendor payment records to prepare accurate P&amp;L, balance sheet, and cash-flow statements.</w:t>
       </w:r>
     </w:p>
     <w:p>
       <w:pPr>
-        <w:spacing w:before="0" w:after="60" w:line="276" w:lineRule="auto"/>
+        <w:spacing w:after="60" w:line="276" w:lineRule="auto"/>
         <w:ind w:left="274" w:hanging="187"/>
       </w:pPr>
       <w:r>
@@ -1821,7 +1873,7 @@
           <w:color w:val="000000"/>
           <w:sz w:val="20"/>
         </w:rPr>
-        <w:t>Handled EN–JA and EN–ES technical documentation translation, localization QA, and enterprise technical escalations for clients in Japan and Latin America.</w:t>
+        <w:t>Supported Japanese- and Spanish-speaking small business owners with bilingual bookkeeping setup, invoice localization, and expense tracking.</w:t>
       </w:r>
     </w:p>
     <w:p>
@@ -1840,12 +1892,12 @@
           <w:color w:val="1A3A5C"/>
           <w:sz w:val="23"/>
         </w:rPr>
-        <w:t>SELECTED PROJECTS &amp; ENGINEERING CONTRIBUTIONS</w:t>
+        <w:t>SELECTED PROJECTS &amp; BUSINESS CONTRIBUTIONS</w:t>
       </w:r>
     </w:p>
     <w:p>
       <w:pPr>
-        <w:spacing w:before="0" w:after="60" w:line="276" w:lineRule="auto"/>
+        <w:spacing w:after="60" w:line="276" w:lineRule="auto"/>
         <w:ind w:left="274" w:hanging="187"/>
       </w:pPr>
       <w:r>
@@ -1866,7 +1918,7 @@
           <w:color w:val="000000"/>
           <w:sz w:val="20"/>
         </w:rPr>
-        <w:t xml:space="preserve">Distributed Rate Limiter: </w:t>
+        <w:t xml:space="preserve">SME Accounting AI Rollout: </w:t>
       </w:r>
       <w:r>
         <w:rPr>
@@ -1876,12 +1928,12 @@
           <w:color w:val="000000"/>
           <w:sz w:val="20"/>
         </w:rPr>
-        <w:t>Redis-backed sliding-window rate limiter in Go, handling 500K req/s with sub-millisecond overhead; open-sourced with English and Japanese documentation and 1,500+ stars.</w:t>
+        <w:t>Deployed and audited AI receipt OCR, auto-categorization rules, and cash-flow alerts across QuickBooks Online, Xero, and Zoho Books for 120+ retail, wholesale, and service SMEs.</w:t>
       </w:r>
     </w:p>
     <w:p>
       <w:pPr>
-        <w:spacing w:before="0" w:after="60" w:line="276" w:lineRule="auto"/>
+        <w:spacing w:after="60" w:line="276" w:lineRule="auto"/>
         <w:ind w:left="274" w:hanging="187"/>
       </w:pPr>
       <w:r>
@@ -1902,7 +1954,7 @@
           <w:color w:val="000000"/>
           <w:sz w:val="20"/>
         </w:rPr>
-        <w:t xml:space="preserve">Event-Driven Ledger: </w:t>
+        <w:t xml:space="preserve">Cross-Border Landed-Cost &amp; Freight Model: </w:t>
       </w:r>
       <w:r>
         <w:rPr>
@@ -1912,12 +1964,12 @@
           <w:color w:val="000000"/>
           <w:sz w:val="20"/>
         </w:rPr>
-        <w:t>Kafka-based immutable ledger with exactly-once processing and full auditability for multi-currency regulated workloads (USD, JPY, EUR/LATAM).</w:t>
+        <w:t>Built an AI-assisted Excel &amp; Power BI model forecasting container transit times, customs duties, and SKU margin impact across Japan, U.S., LATAM, and East Africa trade lanes.</w:t>
       </w:r>
     </w:p>
     <w:p>
       <w:pPr>
-        <w:spacing w:before="0" w:after="60" w:line="276" w:lineRule="auto"/>
+        <w:spacing w:after="60" w:line="276" w:lineRule="auto"/>
         <w:ind w:left="274" w:hanging="187"/>
       </w:pPr>
       <w:r>
@@ -1938,7 +1990,7 @@
           <w:color w:val="000000"/>
           <w:sz w:val="20"/>
         </w:rPr>
-        <w:t xml:space="preserve">Algorithmic Problem Library: </w:t>
+        <w:t xml:space="preserve">Multilingual Accounting &amp; Logistics AI Benchmark: </w:t>
       </w:r>
       <w:r>
         <w:rPr>
@@ -1948,12 +2000,12 @@
           <w:color w:val="000000"/>
           <w:sz w:val="20"/>
         </w:rPr>
-        <w:t>Authored 200+ original coding problems (graphs, DP, concurrency, systems) with reference solutions, complexity analysis, and edge-case tests.</w:t>
+        <w:t>Created a 250-scenario evaluation suite testing AI accuracy on bookkeeping rules, financial analysis, Japanese business keigo, and Spanish trade terminology.</w:t>
       </w:r>
     </w:p>
     <w:p>
       <w:pPr>
-        <w:spacing w:before="0" w:after="60" w:line="276" w:lineRule="auto"/>
+        <w:spacing w:after="60" w:line="276" w:lineRule="auto"/>
         <w:ind w:left="274" w:hanging="187"/>
       </w:pPr>
       <w:r>
@@ -1974,7 +2026,7 @@
           <w:color w:val="000000"/>
           <w:sz w:val="20"/>
         </w:rPr>
-        <w:t xml:space="preserve">Multilingual AI &amp; Code Review Benchmark: </w:t>
+        <w:t xml:space="preserve">Working-Capital &amp; Inventory Exception Tracker: </w:t>
       </w:r>
       <w:r>
         <w:rPr>
@@ -1984,12 +2036,12 @@
           <w:color w:val="000000"/>
           <w:sz w:val="20"/>
         </w:rPr>
-        <w:t>Built an internal benchmark of 250 real-world code-review and technical translation scenarios across English, Japanese, and Spanish used to evaluate LLM quality.</w:t>
+        <w:t>Designed automated BI alerts flagging slow-moving inventory, overdue receivables, and duplicate supplier billings prior to month-end close.</w:t>
       </w:r>
     </w:p>
     <w:p>
       <w:pPr>
-        <w:spacing w:before="0" w:after="60" w:line="276" w:lineRule="auto"/>
+        <w:spacing w:after="60" w:line="276" w:lineRule="auto"/>
         <w:ind w:left="274" w:hanging="187"/>
       </w:pPr>
       <w:r>
@@ -2010,7 +2062,7 @@
           <w:color w:val="000000"/>
           <w:sz w:val="20"/>
         </w:rPr>
-        <w:t xml:space="preserve">Monolith-to-Microservices Migration: </w:t>
+        <w:t xml:space="preserve">Trilingual SME Bookkeeping SOP Kit: </w:t>
       </w:r>
       <w:r>
         <w:rPr>
@@ -2020,7 +2072,7 @@
           <w:color w:val="000000"/>
           <w:sz w:val="20"/>
         </w:rPr>
-        <w:t>Led incremental migration of a 1.5M-line monolith to 15 bounded-context services with full English, Japanese, and Spanish localization and zero downtime.</w:t>
+        <w:t>Authored standardized chart-of-accounts templates and onboarding guides in English, Japanese, and Spanish for cross-border small businesses.</w:t>
       </w:r>
     </w:p>
     <w:p>
@@ -2039,7 +2091,7 @@
           <w:color w:val="1A3A5C"/>
           <w:sz w:val="23"/>
         </w:rPr>
-        <w:t>TECHNICAL SKILLS</w:t>
+        <w:t>BUSINESS, ANALYTICS &amp; ACCOUNTING SKILLS</w:t>
       </w:r>
     </w:p>
     <w:tbl>
@@ -2094,7 +2146,7 @@
                 <w:color w:val="000000"/>
                 <w:sz w:val="19"/>
               </w:rPr>
-              <w:t xml:space="preserve">Programming: </w:t>
+              <w:t xml:space="preserve">SME Accounting Software: </w:t>
             </w:r>
             <w:r>
               <w:rPr>
@@ -2104,7 +2156,7 @@
                 <w:color w:val="000000"/>
                 <w:sz w:val="19"/>
               </w:rPr>
-              <w:t>Python, Go, Java, TypeScript, JavaScript, Rust (working), C#, SQL</w:t>
+              <w:t>QuickBooks Online, Xero, Zoho Books, Sage Business Cloud, Wave, FreshBooks</w:t>
             </w:r>
           </w:p>
         </w:tc>
@@ -2134,7 +2186,7 @@
                 <w:color w:val="000000"/>
                 <w:sz w:val="19"/>
               </w:rPr>
-              <w:t xml:space="preserve">Databases: </w:t>
+              <w:t xml:space="preserve">Logistics &amp; Supply Chain: </w:t>
             </w:r>
             <w:r>
               <w:rPr>
@@ -2144,7 +2196,171 @@
                 <w:color w:val="000000"/>
                 <w:sz w:val="19"/>
               </w:rPr>
-              <w:t>PostgreSQL, MySQL, Redis, Cassandra, DynamoDB</w:t>
+              <w:t>Freight &amp; landed-cost analysis, inventory planning, 3PL SLAs, demand forecasting</w:t>
+            </w:r>
+          </w:p>
+        </w:tc>
+      </w:tr>
+      <w:tr>
+        <w:tc>
+          <w:tcPr>
+            <w:tcW w:type="dxa" w:w="5155"/>
+          </w:tcPr>
+          <w:p>
+            <w:pPr>
+              <w:spacing w:after="40"/>
+            </w:pPr>
+            <w:r>
+              <w:rPr>
+                <w:rFonts w:ascii="Arial" w:hAnsi="Arial" w:eastAsia="MS Gothic"/>
+                <w:b w:val="0"/>
+                <w:i w:val="0"/>
+                <w:color w:val="000000"/>
+                <w:sz w:val="19"/>
+              </w:rPr>
+              <w:t xml:space="preserve">•  </w:t>
+            </w:r>
+            <w:r>
+              <w:rPr>
+                <w:rFonts w:ascii="Arial" w:hAnsi="Arial" w:eastAsia="MS Gothic"/>
+                <w:b/>
+                <w:i w:val="0"/>
+                <w:color w:val="000000"/>
+                <w:sz w:val="19"/>
+              </w:rPr>
+              <w:t xml:space="preserve">AI Accounting Workflows: </w:t>
+            </w:r>
+            <w:r>
+              <w:rPr>
+                <w:rFonts w:ascii="Arial" w:hAnsi="Arial" w:eastAsia="MS Gothic"/>
+                <w:b w:val="0"/>
+                <w:i w:val="0"/>
+                <w:color w:val="000000"/>
+                <w:sz w:val="19"/>
+              </w:rPr>
+              <w:t>Invoice/receipt OCR, smart ledger categorization, bank rules, AI cash-flow forecasting</w:t>
+            </w:r>
+          </w:p>
+        </w:tc>
+        <w:tc>
+          <w:tcPr>
+            <w:tcW w:type="dxa" w:w="5155"/>
+          </w:tcPr>
+          <w:p>
+            <w:pPr>
+              <w:spacing w:after="40"/>
+            </w:pPr>
+            <w:r>
+              <w:rPr>
+                <w:rFonts w:ascii="Arial" w:hAnsi="Arial" w:eastAsia="MS Gothic"/>
+                <w:b w:val="0"/>
+                <w:i w:val="0"/>
+                <w:color w:val="000000"/>
+                <w:sz w:val="19"/>
+              </w:rPr>
+              <w:t xml:space="preserve">   •  </w:t>
+            </w:r>
+            <w:r>
+              <w:rPr>
+                <w:rFonts w:ascii="Arial" w:hAnsi="Arial" w:eastAsia="MS Gothic"/>
+                <w:b/>
+                <w:i w:val="0"/>
+                <w:color w:val="000000"/>
+                <w:sz w:val="19"/>
+              </w:rPr>
+              <w:t xml:space="preserve">Financial Operations: </w:t>
+            </w:r>
+            <w:r>
+              <w:rPr>
+                <w:rFonts w:ascii="Arial" w:hAnsi="Arial" w:eastAsia="MS Gothic"/>
+                <w:b w:val="0"/>
+                <w:i w:val="0"/>
+                <w:color w:val="000000"/>
+                <w:sz w:val="19"/>
+              </w:rPr>
+              <w:t>AP/AR automation, multi-currency reconciliation (USD, KES, JPY, EUR), VAT/tax prep, P&amp;L</w:t>
+            </w:r>
+          </w:p>
+        </w:tc>
+      </w:tr>
+      <w:tr>
+        <w:tc>
+          <w:tcPr>
+            <w:tcW w:type="dxa" w:w="5155"/>
+          </w:tcPr>
+          <w:p>
+            <w:pPr>
+              <w:spacing w:after="40"/>
+            </w:pPr>
+            <w:r>
+              <w:rPr>
+                <w:rFonts w:ascii="Arial" w:hAnsi="Arial" w:eastAsia="MS Gothic"/>
+                <w:b w:val="0"/>
+                <w:i w:val="0"/>
+                <w:color w:val="000000"/>
+                <w:sz w:val="19"/>
+              </w:rPr>
+              <w:t xml:space="preserve">•  </w:t>
+            </w:r>
+            <w:r>
+              <w:rPr>
+                <w:rFonts w:ascii="Arial" w:hAnsi="Arial" w:eastAsia="MS Gothic"/>
+                <w:b/>
+                <w:i w:val="0"/>
+                <w:color w:val="000000"/>
+                <w:sz w:val="19"/>
+              </w:rPr>
+              <w:t xml:space="preserve">Data Analysis &amp; BI: </w:t>
+            </w:r>
+            <w:r>
+              <w:rPr>
+                <w:rFonts w:ascii="Arial" w:hAnsi="Arial" w:eastAsia="MS Gothic"/>
+                <w:b w:val="0"/>
+                <w:i w:val="0"/>
+                <w:color w:val="000000"/>
+                <w:sz w:val="19"/>
+              </w:rPr>
+              <w:t>Excel (Power Query, PivotTables, XLOOKUP), Power BI, Tableau, Looker Studio, SQL reporting</w:t>
+            </w:r>
+          </w:p>
+        </w:tc>
+        <w:tc>
+          <w:tcPr>
+            <w:tcW w:type="dxa" w:w="5155"/>
+          </w:tcPr>
+          <w:p>
+            <w:pPr>
+              <w:spacing w:after="40"/>
+            </w:pPr>
+            <w:r>
+              <w:rPr>
+                <w:rFonts w:ascii="Arial" w:hAnsi="Arial" w:eastAsia="MS Gothic"/>
+                <w:b w:val="0"/>
+                <w:i w:val="0"/>
+                <w:color w:val="000000"/>
+                <w:sz w:val="19"/>
+              </w:rPr>
+              <w:t xml:space="preserve">   •  </w:t>
+            </w:r>
+            <w:r>
+              <w:rPr>
+                <w:rFonts w:ascii="Arial" w:hAnsi="Arial" w:eastAsia="MS Gothic"/>
+                <w:b/>
+                <w:i w:val="0"/>
+                <w:color w:val="000000"/>
+                <w:sz w:val="19"/>
+              </w:rPr>
+              <w:t xml:space="preserve">AI &amp; Productivity Tools: </w:t>
+            </w:r>
+            <w:r>
+              <w:rPr>
+                <w:rFonts w:ascii="Arial" w:hAnsi="Arial" w:eastAsia="MS Gothic"/>
+                <w:b w:val="0"/>
+                <w:i w:val="0"/>
+                <w:color w:val="000000"/>
+                <w:sz w:val="19"/>
+              </w:rPr>
+              <w:t>ChatGPT / Claude / Copilot business workflows, prompt evaluation, AI data QA</w:t>
             </w:r>
           </w:p>
         </w:tc>
@@ -2186,7 +2402,7 @@
                 <w:color w:val="000000"/>
                 <w:sz w:val="19"/>
               </w:rPr>
-              <w:t>English (Native), Japanese / 日本語 (JLPT N1), Spanish (DELE C1)</w:t>
+              <w:t>English &amp; Swahili (Native), Japanese / 日本語 (JLPT N1), Spanish / Español (DELE C1)</w:t>
             </w:r>
           </w:p>
         </w:tc>
@@ -2216,7 +2432,7 @@
                 <w:color w:val="000000"/>
                 <w:sz w:val="19"/>
               </w:rPr>
-              <w:t xml:space="preserve">Messaging: </w:t>
+              <w:t xml:space="preserve">Trade &amp; Localization: </w:t>
             </w:r>
             <w:r>
               <w:rPr>
@@ -2226,335 +2442,7 @@
                 <w:color w:val="000000"/>
                 <w:sz w:val="19"/>
               </w:rPr>
-              <w:t>Kafka, RabbitMQ, NATS, gRPC, REST, GraphQL</w:t>
-            </w:r>
-          </w:p>
-        </w:tc>
-      </w:tr>
-      <w:tr>
-        <w:tc>
-          <w:tcPr>
-            <w:tcW w:type="dxa" w:w="5155"/>
-          </w:tcPr>
-          <w:p>
-            <w:pPr>
-              <w:spacing w:after="40"/>
-            </w:pPr>
-            <w:r>
-              <w:rPr>
-                <w:rFonts w:ascii="Arial" w:hAnsi="Arial" w:eastAsia="MS Gothic"/>
-                <w:b w:val="0"/>
-                <w:i w:val="0"/>
-                <w:color w:val="000000"/>
-                <w:sz w:val="19"/>
-              </w:rPr>
-              <w:t xml:space="preserve">•  </w:t>
-            </w:r>
-            <w:r>
-              <w:rPr>
-                <w:rFonts w:ascii="Arial" w:hAnsi="Arial" w:eastAsia="MS Gothic"/>
-                <w:b/>
-                <w:i w:val="0"/>
-                <w:color w:val="000000"/>
-                <w:sz w:val="19"/>
-              </w:rPr>
-              <w:t xml:space="preserve">System Design: </w:t>
-            </w:r>
-            <w:r>
-              <w:rPr>
-                <w:rFonts w:ascii="Arial" w:hAnsi="Arial" w:eastAsia="MS Gothic"/>
-                <w:b w:val="0"/>
-                <w:i w:val="0"/>
-                <w:color w:val="000000"/>
-                <w:sz w:val="19"/>
-              </w:rPr>
-              <w:t>Microservices, event-driven, CQRS, saga, DDD</w:t>
-            </w:r>
-          </w:p>
-        </w:tc>
-        <w:tc>
-          <w:tcPr>
-            <w:tcW w:type="dxa" w:w="5155"/>
-          </w:tcPr>
-          <w:p>
-            <w:pPr>
-              <w:spacing w:after="40"/>
-            </w:pPr>
-            <w:r>
-              <w:rPr>
-                <w:rFonts w:ascii="Arial" w:hAnsi="Arial" w:eastAsia="MS Gothic"/>
-                <w:b w:val="0"/>
-                <w:i w:val="0"/>
-                <w:color w:val="000000"/>
-                <w:sz w:val="19"/>
-              </w:rPr>
-              <w:t xml:space="preserve">   •  </w:t>
-            </w:r>
-            <w:r>
-              <w:rPr>
-                <w:rFonts w:ascii="Arial" w:hAnsi="Arial" w:eastAsia="MS Gothic"/>
-                <w:b/>
-                <w:i w:val="0"/>
-                <w:color w:val="000000"/>
-                <w:sz w:val="19"/>
-              </w:rPr>
-              <w:t xml:space="preserve">Cloud &amp; Infra: </w:t>
-            </w:r>
-            <w:r>
-              <w:rPr>
-                <w:rFonts w:ascii="Arial" w:hAnsi="Arial" w:eastAsia="MS Gothic"/>
-                <w:b w:val="0"/>
-                <w:i w:val="0"/>
-                <w:color w:val="000000"/>
-                <w:sz w:val="19"/>
-              </w:rPr>
-              <w:t>AWS, GCP, Azure, Kubernetes, Docker, Terraform</w:t>
-            </w:r>
-          </w:p>
-        </w:tc>
-      </w:tr>
-      <w:tr>
-        <w:tc>
-          <w:tcPr>
-            <w:tcW w:type="dxa" w:w="5155"/>
-          </w:tcPr>
-          <w:p>
-            <w:pPr>
-              <w:spacing w:after="40"/>
-            </w:pPr>
-            <w:r>
-              <w:rPr>
-                <w:rFonts w:ascii="Arial" w:hAnsi="Arial" w:eastAsia="MS Gothic"/>
-                <w:b w:val="0"/>
-                <w:i w:val="0"/>
-                <w:color w:val="000000"/>
-                <w:sz w:val="19"/>
-              </w:rPr>
-              <w:t xml:space="preserve">•  </w:t>
-            </w:r>
-            <w:r>
-              <w:rPr>
-                <w:rFonts w:ascii="Arial" w:hAnsi="Arial" w:eastAsia="MS Gothic"/>
-                <w:b/>
-                <w:i w:val="0"/>
-                <w:color w:val="000000"/>
-                <w:sz w:val="19"/>
-              </w:rPr>
-              <w:t xml:space="preserve">Localization &amp; NLP: </w:t>
-            </w:r>
-            <w:r>
-              <w:rPr>
-                <w:rFonts w:ascii="Arial" w:hAnsi="Arial" w:eastAsia="MS Gothic"/>
-                <w:b w:val="0"/>
-                <w:i w:val="0"/>
-                <w:color w:val="000000"/>
-                <w:sz w:val="19"/>
-              </w:rPr>
-              <w:t>i18n/L10n, EN–JA &amp; EN–ES translation, CJK tokenization, UTF-8/Shift-JIS</w:t>
-            </w:r>
-          </w:p>
-        </w:tc>
-        <w:tc>
-          <w:tcPr>
-            <w:tcW w:type="dxa" w:w="5155"/>
-          </w:tcPr>
-          <w:p>
-            <w:pPr>
-              <w:spacing w:after="40"/>
-            </w:pPr>
-            <w:r>
-              <w:rPr>
-                <w:rFonts w:ascii="Arial" w:hAnsi="Arial" w:eastAsia="MS Gothic"/>
-                <w:b w:val="0"/>
-                <w:i w:val="0"/>
-                <w:color w:val="000000"/>
-                <w:sz w:val="19"/>
-              </w:rPr>
-              <w:t xml:space="preserve">   •  </w:t>
-            </w:r>
-            <w:r>
-              <w:rPr>
-                <w:rFonts w:ascii="Arial" w:hAnsi="Arial" w:eastAsia="MS Gothic"/>
-                <w:b/>
-                <w:i w:val="0"/>
-                <w:color w:val="000000"/>
-                <w:sz w:val="19"/>
-              </w:rPr>
-              <w:t xml:space="preserve">Observability: </w:t>
-            </w:r>
-            <w:r>
-              <w:rPr>
-                <w:rFonts w:ascii="Arial" w:hAnsi="Arial" w:eastAsia="MS Gothic"/>
-                <w:b w:val="0"/>
-                <w:i w:val="0"/>
-                <w:color w:val="000000"/>
-                <w:sz w:val="19"/>
-              </w:rPr>
-              <w:t>Prometheus, Grafana, OpenTelemetry, Datadog</w:t>
-            </w:r>
-          </w:p>
-        </w:tc>
-      </w:tr>
-      <w:tr>
-        <w:tc>
-          <w:tcPr>
-            <w:tcW w:type="dxa" w:w="5155"/>
-          </w:tcPr>
-          <w:p>
-            <w:pPr>
-              <w:spacing w:after="40"/>
-            </w:pPr>
-            <w:r>
-              <w:rPr>
-                <w:rFonts w:ascii="Arial" w:hAnsi="Arial" w:eastAsia="MS Gothic"/>
-                <w:b w:val="0"/>
-                <w:i w:val="0"/>
-                <w:color w:val="000000"/>
-                <w:sz w:val="19"/>
-              </w:rPr>
-              <w:t xml:space="preserve">•  </w:t>
-            </w:r>
-            <w:r>
-              <w:rPr>
-                <w:rFonts w:ascii="Arial" w:hAnsi="Arial" w:eastAsia="MS Gothic"/>
-                <w:b/>
-                <w:i w:val="0"/>
-                <w:color w:val="000000"/>
-                <w:sz w:val="19"/>
-              </w:rPr>
-              <w:t xml:space="preserve">Architecture: </w:t>
-            </w:r>
-            <w:r>
-              <w:rPr>
-                <w:rFonts w:ascii="Arial" w:hAnsi="Arial" w:eastAsia="MS Gothic"/>
-                <w:b w:val="0"/>
-                <w:i w:val="0"/>
-                <w:color w:val="000000"/>
-                <w:sz w:val="19"/>
-              </w:rPr>
-              <w:t>Distributed systems, CAP, consistency models, ADRs</w:t>
-            </w:r>
-          </w:p>
-        </w:tc>
-        <w:tc>
-          <w:tcPr>
-            <w:tcW w:type="dxa" w:w="5155"/>
-          </w:tcPr>
-          <w:p>
-            <w:pPr>
-              <w:spacing w:after="40"/>
-            </w:pPr>
-            <w:r>
-              <w:rPr>
-                <w:rFonts w:ascii="Arial" w:hAnsi="Arial" w:eastAsia="MS Gothic"/>
-                <w:b w:val="0"/>
-                <w:i w:val="0"/>
-                <w:color w:val="000000"/>
-                <w:sz w:val="19"/>
-              </w:rPr>
-              <w:t xml:space="preserve">   •  </w:t>
-            </w:r>
-            <w:r>
-              <w:rPr>
-                <w:rFonts w:ascii="Arial" w:hAnsi="Arial" w:eastAsia="MS Gothic"/>
-                <w:b/>
-                <w:i w:val="0"/>
-                <w:color w:val="000000"/>
-                <w:sz w:val="19"/>
-              </w:rPr>
-              <w:t xml:space="preserve">Testing &amp; CI/CD: </w:t>
-            </w:r>
-            <w:r>
-              <w:rPr>
-                <w:rFonts w:ascii="Arial" w:hAnsi="Arial" w:eastAsia="MS Gothic"/>
-                <w:b w:val="0"/>
-                <w:i w:val="0"/>
-                <w:color w:val="000000"/>
-                <w:sz w:val="19"/>
-              </w:rPr>
-              <w:t>Unit, contract, property-based, locale QA, GitHub Actions, ArgoCD</w:t>
-            </w:r>
-          </w:p>
-        </w:tc>
-      </w:tr>
-      <w:tr>
-        <w:tc>
-          <w:tcPr>
-            <w:tcW w:type="dxa" w:w="5155"/>
-          </w:tcPr>
-          <w:p>
-            <w:pPr>
-              <w:spacing w:after="40"/>
-            </w:pPr>
-            <w:r>
-              <w:rPr>
-                <w:rFonts w:ascii="Arial" w:hAnsi="Arial" w:eastAsia="MS Gothic"/>
-                <w:b w:val="0"/>
-                <w:i w:val="0"/>
-                <w:color w:val="000000"/>
-                <w:sz w:val="19"/>
-              </w:rPr>
-              <w:t xml:space="preserve">•  </w:t>
-            </w:r>
-            <w:r>
-              <w:rPr>
-                <w:rFonts w:ascii="Arial" w:hAnsi="Arial" w:eastAsia="MS Gothic"/>
-                <w:b/>
-                <w:i w:val="0"/>
-                <w:color w:val="000000"/>
-                <w:sz w:val="19"/>
-              </w:rPr>
-              <w:t xml:space="preserve">Algorithms &amp; Data: </w:t>
-            </w:r>
-            <w:r>
-              <w:rPr>
-                <w:rFonts w:ascii="Arial" w:hAnsi="Arial" w:eastAsia="MS Gothic"/>
-                <w:b w:val="0"/>
-                <w:i w:val="0"/>
-                <w:color w:val="000000"/>
-                <w:sz w:val="19"/>
-              </w:rPr>
-              <w:t>Trees, graphs, heaps, tries, bloom filters, DP, concurrency</w:t>
-            </w:r>
-          </w:p>
-        </w:tc>
-        <w:tc>
-          <w:tcPr>
-            <w:tcW w:type="dxa" w:w="5155"/>
-          </w:tcPr>
-          <w:p>
-            <w:pPr>
-              <w:spacing w:after="40"/>
-            </w:pPr>
-            <w:r>
-              <w:rPr>
-                <w:rFonts w:ascii="Arial" w:hAnsi="Arial" w:eastAsia="MS Gothic"/>
-                <w:b w:val="0"/>
-                <w:i w:val="0"/>
-                <w:color w:val="000000"/>
-                <w:sz w:val="19"/>
-              </w:rPr>
-              <w:t xml:space="preserve">   •  </w:t>
-            </w:r>
-            <w:r>
-              <w:rPr>
-                <w:rFonts w:ascii="Arial" w:hAnsi="Arial" w:eastAsia="MS Gothic"/>
-                <w:b/>
-                <w:i w:val="0"/>
-                <w:color w:val="000000"/>
-                <w:sz w:val="19"/>
-              </w:rPr>
-              <w:t xml:space="preserve">Code &amp; AI Review: </w:t>
-            </w:r>
-            <w:r>
-              <w:rPr>
-                <w:rFonts w:ascii="Arial" w:hAnsi="Arial" w:eastAsia="MS Gothic"/>
-                <w:b w:val="0"/>
-                <w:i w:val="0"/>
-                <w:color w:val="000000"/>
-                <w:sz w:val="19"/>
-              </w:rPr>
-              <w:t>Rubric design, RLHF/SFT evaluation, mentorship, secure coding</w:t>
+              <w:t>Commercial invoices, POs, customs packs, EN–JA &amp; EN–ES business translation</w:t>
             </w:r>
           </w:p>
         </w:tc>
@@ -2581,7 +2469,79 @@
     </w:p>
     <w:p>
       <w:pPr>
-        <w:spacing w:before="0" w:after="60" w:line="276" w:lineRule="auto"/>
+        <w:spacing w:after="60" w:line="276" w:lineRule="auto"/>
+        <w:ind w:left="274" w:hanging="187"/>
+      </w:pPr>
+      <w:r>
+        <w:rPr>
+          <w:rFonts w:ascii="Arial" w:hAnsi="Arial" w:eastAsia="MS Gothic"/>
+          <w:b w:val="0"/>
+          <w:i w:val="0"/>
+          <w:color w:val="000000"/>
+          <w:sz w:val="20"/>
+        </w:rPr>
+        <w:t xml:space="preserve">•  </w:t>
+      </w:r>
+      <w:r>
+        <w:rPr>
+          <w:rFonts w:ascii="Arial" w:hAnsi="Arial" w:eastAsia="MS Gothic"/>
+          <w:b/>
+          <w:i w:val="0"/>
+          <w:color w:val="000000"/>
+          <w:sz w:val="20"/>
+        </w:rPr>
+        <w:t>QuickBooks Online Certified ProAdvisor (Advanced &amp; AI Workflows)</w:t>
+      </w:r>
+      <w:r>
+        <w:rPr>
+          <w:rFonts w:ascii="Arial" w:hAnsi="Arial" w:eastAsia="MS Gothic"/>
+          <w:b w:val="0"/>
+          <w:i w:val="0"/>
+          <w:color w:val="000000"/>
+          <w:sz w:val="20"/>
+        </w:rPr>
+        <w:t xml:space="preserve"> — Intuit Academy, 2024</w:t>
+      </w:r>
+    </w:p>
+    <w:p>
+      <w:pPr>
+        <w:spacing w:after="60" w:line="276" w:lineRule="auto"/>
+        <w:ind w:left="274" w:hanging="187"/>
+      </w:pPr>
+      <w:r>
+        <w:rPr>
+          <w:rFonts w:ascii="Arial" w:hAnsi="Arial" w:eastAsia="MS Gothic"/>
+          <w:b w:val="0"/>
+          <w:i w:val="0"/>
+          <w:color w:val="000000"/>
+          <w:sz w:val="20"/>
+        </w:rPr>
+        <w:t xml:space="preserve">•  </w:t>
+      </w:r>
+      <w:r>
+        <w:rPr>
+          <w:rFonts w:ascii="Arial" w:hAnsi="Arial" w:eastAsia="MS Gothic"/>
+          <w:b/>
+          <w:i w:val="0"/>
+          <w:color w:val="000000"/>
+          <w:sz w:val="20"/>
+        </w:rPr>
+        <w:t>Xero Advisor &amp; Cloud Accounting Certification</w:t>
+      </w:r>
+      <w:r>
+        <w:rPr>
+          <w:rFonts w:ascii="Arial" w:hAnsi="Arial" w:eastAsia="MS Gothic"/>
+          <w:b w:val="0"/>
+          <w:i w:val="0"/>
+          <w:color w:val="000000"/>
+          <w:sz w:val="20"/>
+        </w:rPr>
+        <w:t xml:space="preserve"> — Xero Central, 2023</w:t>
+      </w:r>
+    </w:p>
+    <w:p>
+      <w:pPr>
+        <w:spacing w:after="60" w:line="276" w:lineRule="auto"/>
         <w:ind w:left="274" w:hanging="187"/>
       </w:pPr>
       <w:r>
@@ -2617,7 +2577,7 @@
     </w:p>
     <w:p>
       <w:pPr>
-        <w:spacing w:before="0" w:after="60" w:line="276" w:lineRule="auto"/>
+        <w:spacing w:after="60" w:line="276" w:lineRule="auto"/>
         <w:ind w:left="274" w:hanging="187"/>
       </w:pPr>
       <w:r>
@@ -2653,7 +2613,7 @@
     </w:p>
     <w:p>
       <w:pPr>
-        <w:spacing w:before="0" w:after="60" w:line="276" w:lineRule="auto"/>
+        <w:spacing w:after="60" w:line="276" w:lineRule="auto"/>
         <w:ind w:left="274" w:hanging="187"/>
       </w:pPr>
       <w:r>
@@ -2674,7 +2634,7 @@
           <w:color w:val="000000"/>
           <w:sz w:val="20"/>
         </w:rPr>
-        <w:t>AWS Certified Solutions Architect — Professional</w:t>
+        <w:t>Microsoft Power BI Data Analyst Associate (PL-300)</w:t>
       </w:r>
       <w:r>
         <w:rPr>
@@ -2684,12 +2644,12 @@
           <w:color w:val="000000"/>
           <w:sz w:val="20"/>
         </w:rPr>
-        <w:t xml:space="preserve"> — Amazon Web Services, 2024</w:t>
+        <w:t xml:space="preserve"> — Microsoft, 2023</w:t>
       </w:r>
     </w:p>
     <w:p>
       <w:pPr>
-        <w:spacing w:before="0" w:after="60" w:line="276" w:lineRule="auto"/>
+        <w:spacing w:after="60" w:line="276" w:lineRule="auto"/>
         <w:ind w:left="274" w:hanging="187"/>
       </w:pPr>
       <w:r>
@@ -2710,7 +2670,7 @@
           <w:color w:val="000000"/>
           <w:sz w:val="20"/>
         </w:rPr>
-        <w:t>AI Ethics, Multilingual NLP &amp; Responsible AI</w:t>
+        <w:t>AI for Business, Finance &amp; Operations Specialization</w:t>
       </w:r>
       <w:r>
         <w:rPr>
@@ -2720,12 +2680,12 @@
           <w:color w:val="000000"/>
           <w:sz w:val="20"/>
         </w:rPr>
-        <w:t xml:space="preserve"> — Coursera / DeepLearning.AI, 2024</w:t>
+        <w:t xml:space="preserve"> — Wharton / Coursera, 2024</w:t>
       </w:r>
     </w:p>
     <w:p>
       <w:pPr>
-        <w:spacing w:before="0" w:after="60" w:line="276" w:lineRule="auto"/>
+        <w:spacing w:after="60" w:line="276" w:lineRule="auto"/>
         <w:ind w:left="274" w:hanging="187"/>
       </w:pPr>
       <w:r>
@@ -2746,7 +2706,7 @@
           <w:color w:val="000000"/>
           <w:sz w:val="20"/>
         </w:rPr>
-        <w:t>Certified Kubernetes Administrator (CKA)</w:t>
+        <w:t>Supply Chain Analytics &amp; Logistics Certificate</w:t>
       </w:r>
       <w:r>
         <w:rPr>
@@ -2756,115 +2716,7 @@
           <w:color w:val="000000"/>
           <w:sz w:val="20"/>
         </w:rPr>
-        <w:t xml:space="preserve"> — CNCF, 2023</w:t>
-      </w:r>
-    </w:p>
-    <w:p>
-      <w:pPr>
-        <w:spacing w:before="0" w:after="60" w:line="276" w:lineRule="auto"/>
-        <w:ind w:left="274" w:hanging="187"/>
-      </w:pPr>
-      <w:r>
-        <w:rPr>
-          <w:rFonts w:ascii="Arial" w:hAnsi="Arial" w:eastAsia="MS Gothic"/>
-          <w:b w:val="0"/>
-          <w:i w:val="0"/>
-          <w:color w:val="000000"/>
-          <w:sz w:val="20"/>
-        </w:rPr>
-        <w:t xml:space="preserve">•  </w:t>
-      </w:r>
-      <w:r>
-        <w:rPr>
-          <w:rFonts w:ascii="Arial" w:hAnsi="Arial" w:eastAsia="MS Gothic"/>
-          <w:b/>
-          <w:i w:val="0"/>
-          <w:color w:val="000000"/>
-          <w:sz w:val="20"/>
-        </w:rPr>
-        <w:t>Google Cloud Professional Cloud Architect</w:t>
-      </w:r>
-      <w:r>
-        <w:rPr>
-          <w:rFonts w:ascii="Arial" w:hAnsi="Arial" w:eastAsia="MS Gothic"/>
-          <w:b w:val="0"/>
-          <w:i w:val="0"/>
-          <w:color w:val="000000"/>
-          <w:sz w:val="20"/>
-        </w:rPr>
-        <w:t xml:space="preserve"> — Google Cloud, 2023</w:t>
-      </w:r>
-    </w:p>
-    <w:p>
-      <w:pPr>
-        <w:spacing w:before="0" w:after="60" w:line="276" w:lineRule="auto"/>
-        <w:ind w:left="274" w:hanging="187"/>
-      </w:pPr>
-      <w:r>
-        <w:rPr>
-          <w:rFonts w:ascii="Arial" w:hAnsi="Arial" w:eastAsia="MS Gothic"/>
-          <w:b w:val="0"/>
-          <w:i w:val="0"/>
-          <w:color w:val="000000"/>
-          <w:sz w:val="20"/>
-        </w:rPr>
-        <w:t xml:space="preserve">•  </w:t>
-      </w:r>
-      <w:r>
-        <w:rPr>
-          <w:rFonts w:ascii="Arial" w:hAnsi="Arial" w:eastAsia="MS Gothic"/>
-          <w:b/>
-          <w:i w:val="0"/>
-          <w:color w:val="000000"/>
-          <w:sz w:val="20"/>
-        </w:rPr>
-        <w:t>Azure Solutions Architect Expert</w:t>
-      </w:r>
-      <w:r>
-        <w:rPr>
-          <w:rFonts w:ascii="Arial" w:hAnsi="Arial" w:eastAsia="MS Gothic"/>
-          <w:b w:val="0"/>
-          <w:i w:val="0"/>
-          <w:color w:val="000000"/>
-          <w:sz w:val="20"/>
-        </w:rPr>
-        <w:t xml:space="preserve"> — Microsoft, 2022</w:t>
-      </w:r>
-    </w:p>
-    <w:p>
-      <w:pPr>
-        <w:spacing w:before="0" w:after="60" w:line="276" w:lineRule="auto"/>
-        <w:ind w:left="274" w:hanging="187"/>
-      </w:pPr>
-      <w:r>
-        <w:rPr>
-          <w:rFonts w:ascii="Arial" w:hAnsi="Arial" w:eastAsia="MS Gothic"/>
-          <w:b w:val="0"/>
-          <w:i w:val="0"/>
-          <w:color w:val="000000"/>
-          <w:sz w:val="20"/>
-        </w:rPr>
-        <w:t xml:space="preserve">•  </w:t>
-      </w:r>
-      <w:r>
-        <w:rPr>
-          <w:rFonts w:ascii="Arial" w:hAnsi="Arial" w:eastAsia="MS Gothic"/>
-          <w:b/>
-          <w:i w:val="0"/>
-          <w:color w:val="000000"/>
-          <w:sz w:val="20"/>
-        </w:rPr>
-        <w:t>Confluent Certified Developer for Apache Kafka</w:t>
-      </w:r>
-      <w:r>
-        <w:rPr>
-          <w:rFonts w:ascii="Arial" w:hAnsi="Arial" w:eastAsia="MS Gothic"/>
-          <w:b w:val="0"/>
-          <w:i w:val="0"/>
-          <w:color w:val="000000"/>
-          <w:sz w:val="20"/>
-        </w:rPr>
-        <w:t xml:space="preserve"> — Confluent, 2022</w:t>
+        <w:t xml:space="preserve"> — MITx MicroMasters Module, 2022</w:t>
       </w:r>
     </w:p>
     <w:p>
@@ -2883,12 +2735,12 @@
           <w:color w:val="1A3A5C"/>
           <w:sz w:val="23"/>
         </w:rPr>
-        <w:t>PUBLICATIONS &amp; TALKS</w:t>
+        <w:t>INDUSTRY PUBLICATIONS &amp; TALKS</w:t>
       </w:r>
     </w:p>
     <w:p>
       <w:pPr>
-        <w:spacing w:before="0" w:after="60" w:line="276" w:lineRule="auto"/>
+        <w:spacing w:after="60" w:line="276" w:lineRule="auto"/>
         <w:ind w:left="274" w:hanging="187"/>
       </w:pPr>
       <w:r>
@@ -2909,7 +2761,7 @@
           <w:color w:val="000000"/>
           <w:sz w:val="20"/>
         </w:rPr>
-        <w:t xml:space="preserve">Renae, P. M., &amp; Chen, L. “Latency-Aware Scheduling for Multi-Region Microservices.” </w:t>
+        <w:t xml:space="preserve">Renae, P. M. “Practical AI Automation in Small Business Bookkeeping: Reducing Close Time Without Losing Audit Control.” Presented at </w:t>
       </w:r>
       <w:r>
         <w:rPr>
@@ -2919,7 +2771,7 @@
           <w:color w:val="000000"/>
           <w:sz w:val="20"/>
         </w:rPr>
-        <w:t>IEEE International Conference on Cloud Computing</w:t>
+        <w:t>SMB Finance &amp; Operations Forum</w:t>
       </w:r>
       <w:r>
         <w:rPr>
@@ -2929,12 +2781,12 @@
           <w:color w:val="000000"/>
           <w:sz w:val="20"/>
         </w:rPr>
-        <w:t>, 2024.</w:t>
+        <w:t>, 2025.</w:t>
       </w:r>
     </w:p>
     <w:p>
       <w:pPr>
-        <w:spacing w:before="0" w:after="60" w:line="276" w:lineRule="auto"/>
+        <w:spacing w:after="60" w:line="276" w:lineRule="auto"/>
         <w:ind w:left="274" w:hanging="187"/>
       </w:pPr>
       <w:r>
@@ -2955,7 +2807,7 @@
           <w:color w:val="000000"/>
           <w:sz w:val="20"/>
         </w:rPr>
-        <w:t xml:space="preserve">Renae, P. M. “Exactly-Once Semantics in Practice: Lessons from 2B Tasks/Month.” Presented at </w:t>
+        <w:t xml:space="preserve">Renae, P. M., &amp; Chen, L. “AI-Assisted Demand and Landed-Cost Forecasting for Cross-Border Small Businesses.” </w:t>
       </w:r>
       <w:r>
         <w:rPr>
@@ -2965,7 +2817,7 @@
           <w:color w:val="000000"/>
           <w:sz w:val="20"/>
         </w:rPr>
-        <w:t>Kafka Summit North America</w:t>
+        <w:t>Supply Chain Analytics Symposium</w:t>
       </w:r>
       <w:r>
         <w:rPr>
@@ -2975,12 +2827,12 @@
           <w:color w:val="000000"/>
           <w:sz w:val="20"/>
         </w:rPr>
-        <w:t>, Austin, TX, 2023.</w:t>
+        <w:t>, 2024.</w:t>
       </w:r>
     </w:p>
     <w:p>
       <w:pPr>
-        <w:spacing w:before="0" w:after="60" w:line="276" w:lineRule="auto"/>
+        <w:spacing w:after="60" w:line="276" w:lineRule="auto"/>
         <w:ind w:left="274" w:hanging="187"/>
       </w:pPr>
       <w:r>
@@ -3001,7 +2853,7 @@
           <w:color w:val="000000"/>
           <w:sz w:val="20"/>
         </w:rPr>
-        <w:t xml:space="preserve">Renae, P. M. “Debugging Distributed Systems &amp; Multilingual Pipelines Without Losing Your Mind.” Presented at </w:t>
+        <w:t xml:space="preserve">Renae, P. M. “Bridging English, Japanese, and Spanish Procurement Operations with Multilingual AI Workflows.” </w:t>
       </w:r>
       <w:r>
         <w:rPr>
@@ -3011,7 +2863,7 @@
           <w:color w:val="000000"/>
           <w:sz w:val="20"/>
         </w:rPr>
-        <w:t>DevOps Days Austin</w:t>
+        <w:t>Global Trade &amp; Localization Workshop</w:t>
       </w:r>
       <w:r>
         <w:rPr>
@@ -3021,53 +2873,7 @@
           <w:color w:val="000000"/>
           <w:sz w:val="20"/>
         </w:rPr>
-        <w:t>, 2025.</w:t>
-      </w:r>
-    </w:p>
-    <w:p>
-      <w:pPr>
-        <w:spacing w:before="0" w:after="60" w:line="276" w:lineRule="auto"/>
-        <w:ind w:left="274" w:hanging="187"/>
-      </w:pPr>
-      <w:r>
-        <w:rPr>
-          <w:rFonts w:ascii="Arial" w:hAnsi="Arial" w:eastAsia="MS Gothic"/>
-          <w:b w:val="0"/>
-          <w:i w:val="0"/>
-          <w:color w:val="000000"/>
-          <w:sz w:val="20"/>
-        </w:rPr>
-        <w:t xml:space="preserve">•  </w:t>
-      </w:r>
-      <w:r>
-        <w:rPr>
-          <w:rFonts w:ascii="Arial" w:hAnsi="Arial" w:eastAsia="MS Gothic"/>
-          <w:b w:val="0"/>
-          <w:i w:val="0"/>
-          <w:color w:val="000000"/>
-          <w:sz w:val="20"/>
-        </w:rPr>
-        <w:t xml:space="preserve">Renae, P. M., &amp; Patel, R. “Cross-Lingual Graph-Based Entity Resolution Across CJK and Latin Scripts.” </w:t>
-      </w:r>
-      <w:r>
-        <w:rPr>
-          <w:rFonts w:ascii="Arial" w:hAnsi="Arial" w:eastAsia="MS Gothic"/>
-          <w:b w:val="0"/>
-          <w:i/>
-          <w:color w:val="000000"/>
-          <w:sz w:val="20"/>
-        </w:rPr>
-        <w:t>ACM SIGMOD Workshop</w:t>
-      </w:r>
-      <w:r>
-        <w:rPr>
-          <w:rFonts w:ascii="Arial" w:hAnsi="Arial" w:eastAsia="MS Gothic"/>
-          <w:b w:val="0"/>
-          <w:i w:val="0"/>
-          <w:color w:val="000000"/>
-          <w:sz w:val="20"/>
-        </w:rPr>
-        <w:t>, 2022.</w:t>
+        <w:t>, 2023.</w:t>
       </w:r>
     </w:p>
     <w:p>
@@ -3086,7 +2892,7 @@
           <w:color w:val="1A3A5C"/>
           <w:sz w:val="23"/>
         </w:rPr>
-        <w:t>TEACHING &amp; MENTORSHIP</w:t>
+        <w:t>TRAINING &amp; CLIENT ENABLEMENT</w:t>
       </w:r>
     </w:p>
     <w:tbl>
@@ -3120,7 +2926,7 @@
         </w:trPr>
         <w:tc>
           <w:tcPr>
-            <w:tcW w:type="dxa" w:w="6696"/>
+            <w:tcW w:type="dxa" w:w="6552"/>
           </w:tcPr>
           <w:p>
             <w:pPr>
@@ -3135,13 +2941,13 @@
                 <w:color w:val="000000"/>
                 <w:sz w:val="20"/>
               </w:rPr>
-              <w:t>Engineering Mentor &amp; Bilingual Design Review Lead</w:t>
+              <w:t>SME Accounting AI &amp; Operations Trainer</w:t>
             </w:r>
           </w:p>
         </w:tc>
         <w:tc>
           <w:tcPr>
-            <w:tcW w:type="dxa" w:w="3614"/>
+            <w:tcW w:type="dxa" w:w="3758"/>
           </w:tcPr>
           <w:p>
             <w:pPr>
@@ -3168,7 +2974,7 @@
         </w:trPr>
         <w:tc>
           <w:tcPr>
-            <w:tcW w:type="dxa" w:w="6696"/>
+            <w:tcW w:type="dxa" w:w="6552"/>
           </w:tcPr>
           <w:p>
             <w:pPr>
@@ -3183,13 +2989,13 @@
                 <w:color w:val="000000"/>
                 <w:sz w:val="19"/>
               </w:rPr>
-              <w:t>Fortune 100 Technology Company — Remote (Nairobi, Kenya)</w:t>
+              <w:t>Global Trade &amp; SMB Advisory Group — Remote (Nairobi, Kenya)</w:t>
             </w:r>
           </w:p>
         </w:tc>
         <w:tc>
           <w:tcPr>
-            <w:tcW w:type="dxa" w:w="3614"/>
+            <w:tcW w:type="dxa" w:w="3758"/>
           </w:tcPr>
           <w:p>
             <w:pPr>
@@ -3205,7 +3011,7 @@
                 <w:color w:val="000000"/>
                 <w:sz w:val="19"/>
               </w:rPr>
-              <w:t>Mentorship &amp; Training</w:t>
+              <w:t>Client Enablement &amp; Training</w:t>
             </w:r>
           </w:p>
         </w:tc>
@@ -3213,7 +3019,7 @@
     </w:tbl>
     <w:p>
       <w:pPr>
-        <w:spacing w:before="0" w:after="60" w:line="276" w:lineRule="auto"/>
+        <w:spacing w:after="60" w:line="276" w:lineRule="auto"/>
         <w:ind w:left="274" w:hanging="187"/>
       </w:pPr>
       <w:r>
@@ -3234,12 +3040,12 @@
           <w:color w:val="000000"/>
           <w:sz w:val="20"/>
         </w:rPr>
-        <w:t>Mentored 5 mid-level engineers across U.S., Tokyo, and LATAM teams; 2 promoted to senior within 18 months.</w:t>
+        <w:t>Trained 15+ bookkeepers, inventory planners, and small-business owners on QuickBooks Online, Xero, Zoho Books AI tools, and Power BI dashboards.</w:t>
       </w:r>
     </w:p>
     <w:p>
       <w:pPr>
-        <w:spacing w:before="0" w:after="60" w:line="276" w:lineRule="auto"/>
+        <w:spacing w:after="60" w:line="276" w:lineRule="auto"/>
         <w:ind w:left="274" w:hanging="187"/>
       </w:pPr>
       <w:r>
@@ -3260,33 +3066,7 @@
           <w:color w:val="000000"/>
           <w:sz w:val="20"/>
         </w:rPr>
-        <w:t>Ran bi-weekly “Design Deep Dive” sessions on system design, debugging, localization architecture, and code review.</w:t>
-      </w:r>
-    </w:p>
-    <w:p>
-      <w:pPr>
-        <w:spacing w:before="0" w:after="60" w:line="276" w:lineRule="auto"/>
-        <w:ind w:left="274" w:hanging="187"/>
-      </w:pPr>
-      <w:r>
-        <w:rPr>
-          <w:rFonts w:ascii="Arial" w:hAnsi="Arial" w:eastAsia="MS Gothic"/>
-          <w:b w:val="0"/>
-          <w:i w:val="0"/>
-          <w:color w:val="000000"/>
-          <w:sz w:val="20"/>
-        </w:rPr>
-        <w:t xml:space="preserve">•  </w:t>
-      </w:r>
-      <w:r>
-        <w:rPr>
-          <w:rFonts w:ascii="Arial" w:hAnsi="Arial" w:eastAsia="MS Gothic"/>
-          <w:b w:val="0"/>
-          <w:i w:val="0"/>
-          <w:color w:val="000000"/>
-          <w:sz w:val="20"/>
-        </w:rPr>
-        <w:t>Authored 30+ ADRs and the org-wide code-review and i18n quality rubric across English, Japanese, and Spanish engineering groups.</w:t>
+        <w:t>Authored step-by-step SOPs and quality review checklists for AI-generated bookkeeping entries and logistics reports across English, Japanese, and Spanish teams.</w:t>
       </w:r>
     </w:p>
     <w:tbl>
@@ -3320,7 +3100,7 @@
         </w:trPr>
         <w:tc>
           <w:tcPr>
-            <w:tcW w:type="dxa" w:w="6696"/>
+            <w:tcW w:type="dxa" w:w="6552"/>
           </w:tcPr>
           <w:p>
             <w:pPr>
@@ -3335,23 +3115,13 @@
                 <w:color w:val="000000"/>
                 <w:sz w:val="20"/>
               </w:rPr>
-              <w:t xml:space="preserve">Corporate Trainer — </w:t>
-            </w:r>
-            <w:r>
-              <w:rPr>
-                <w:rFonts w:ascii="Arial" w:hAnsi="Arial" w:eastAsia="MS Gothic"/>
-                <w:b/>
-                <w:i/>
-                <w:color w:val="000000"/>
-                <w:sz w:val="20"/>
-              </w:rPr>
-              <w:t>Backend &amp; Localization Onboarding</w:t>
+              <w:t>Business Analytics &amp; Cross-Border Operations Coordinator</w:t>
             </w:r>
           </w:p>
         </w:tc>
         <w:tc>
           <w:tcPr>
-            <w:tcW w:type="dxa" w:w="3614"/>
+            <w:tcW w:type="dxa" w:w="3758"/>
           </w:tcPr>
           <w:p>
             <w:pPr>
@@ -3378,7 +3148,7 @@
         </w:trPr>
         <w:tc>
           <w:tcPr>
-            <w:tcW w:type="dxa" w:w="6696"/>
+            <w:tcW w:type="dxa" w:w="6552"/>
           </w:tcPr>
           <w:p>
             <w:pPr>
@@ -3393,13 +3163,13 @@
                 <w:color w:val="000000"/>
                 <w:sz w:val="19"/>
               </w:rPr>
-              <w:t>Top-Tier Consumer Technology Company, Seattle, WA, USA (OPT)</w:t>
+              <w:t>Pacific Cross-Border Commerce Corp., Seattle, WA, USA (OPT)</w:t>
             </w:r>
           </w:p>
         </w:tc>
         <w:tc>
           <w:tcPr>
-            <w:tcW w:type="dxa" w:w="3614"/>
+            <w:tcW w:type="dxa" w:w="3758"/>
           </w:tcPr>
           <w:p>
             <w:pPr>
@@ -3415,7 +3185,7 @@
                 <w:color w:val="000000"/>
                 <w:sz w:val="19"/>
               </w:rPr>
-              <w:t>Curriculum &amp; Instruction</w:t>
+              <w:t>Workshops &amp; SOPs</w:t>
             </w:r>
           </w:p>
         </w:tc>
@@ -3423,7 +3193,7 @@
     </w:tbl>
     <w:p>
       <w:pPr>
-        <w:spacing w:before="0" w:after="60" w:line="276" w:lineRule="auto"/>
+        <w:spacing w:after="60" w:line="276" w:lineRule="auto"/>
         <w:ind w:left="274" w:hanging="187"/>
       </w:pPr>
       <w:r>
@@ -3444,33 +3214,7 @@
           <w:color w:val="000000"/>
           <w:sz w:val="20"/>
         </w:rPr>
-        <w:t>Co-designed onboarding curriculum covering backend engineering, testing, internationalization (i18n), and secure coding.</w:t>
-      </w:r>
-    </w:p>
-    <w:p>
-      <w:pPr>
-        <w:spacing w:before="0" w:after="60" w:line="276" w:lineRule="auto"/>
-        <w:ind w:left="274" w:hanging="187"/>
-      </w:pPr>
-      <w:r>
-        <w:rPr>
-          <w:rFonts w:ascii="Arial" w:hAnsi="Arial" w:eastAsia="MS Gothic"/>
-          <w:b w:val="0"/>
-          <w:i w:val="0"/>
-          <w:color w:val="000000"/>
-          <w:sz w:val="20"/>
-        </w:rPr>
-        <w:t xml:space="preserve">•  </w:t>
-      </w:r>
-      <w:r>
-        <w:rPr>
-          <w:rFonts w:ascii="Arial" w:hAnsi="Arial" w:eastAsia="MS Gothic"/>
-          <w:b w:val="0"/>
-          <w:i w:val="0"/>
-          <w:color w:val="000000"/>
-          <w:sz w:val="20"/>
-        </w:rPr>
-        <w:t>Ran weekly code-review and bilingual documentation workshops across English, Japanese, and Spanish cohorts (20+ engineers per cohort).</w:t>
+        <w:t>Facilitated onboarding workshops on Excel Power Query modeling, carrier SLA tracking, and bilingual supplier documentation standards.</w:t>
       </w:r>
     </w:p>
     <w:p>
@@ -3494,7 +3238,7 @@
     </w:p>
     <w:p>
       <w:pPr>
-        <w:spacing w:before="0" w:after="60" w:line="276" w:lineRule="auto"/>
+        <w:spacing w:after="60" w:line="276" w:lineRule="auto"/>
         <w:ind w:left="274" w:hanging="187"/>
       </w:pPr>
       <w:r>
@@ -3525,12 +3269,12 @@
           <w:color w:val="000000"/>
           <w:sz w:val="20"/>
         </w:rPr>
-        <w:t xml:space="preserve"> — Native proficiency (written &amp; spoken; U.S. university-trained technical &amp; editorial writing)</w:t>
+        <w:t xml:space="preserve"> — Native proficiency (written &amp; spoken; executive business reporting, financial documentation &amp; stakeholder briefings)</w:t>
       </w:r>
     </w:p>
     <w:p>
       <w:pPr>
-        <w:spacing w:before="0" w:after="60" w:line="276" w:lineRule="auto"/>
+        <w:spacing w:after="60" w:line="276" w:lineRule="auto"/>
         <w:ind w:left="274" w:hanging="187"/>
       </w:pPr>
       <w:r>
@@ -3561,12 +3305,12 @@
           <w:color w:val="000000"/>
           <w:sz w:val="20"/>
         </w:rPr>
-        <w:t xml:space="preserve"> — Full professional &amp; business fluency (JLPT N1 Certified | 5 years professional experience in corporate keigo [尊敬語・謙譲語・丁寧語], EN–JA technical translation, software/UI localization QA, CJK tokenization, Tokyo team collaboration, and Japanese AI prompt/response evaluation)</w:t>
+        <w:t xml:space="preserve"> — Full professional &amp; business fluency (JLPT N1 Certified | 5 years professional experience in corporate keigo [尊敬語・謙譲語・丁寧語], Japanese supplier/logistics coordination, invoice &amp; trade translation, and Japanese AI business prompt evaluation)</w:t>
       </w:r>
     </w:p>
     <w:p>
       <w:pPr>
-        <w:spacing w:before="0" w:after="60" w:line="276" w:lineRule="auto"/>
+        <w:spacing w:after="60" w:line="276" w:lineRule="auto"/>
         <w:ind w:left="274" w:hanging="187"/>
       </w:pPr>
       <w:r>
@@ -3597,7 +3341,7 @@
           <w:color w:val="000000"/>
           <w:sz w:val="20"/>
         </w:rPr>
-        <w:t xml:space="preserve"> — Full professional fluency (DELE C1 Certified | 5 years professional experience in neutral international, Latin American, and Peninsular Spanish registers, EN–ES technical translation, documentation localization, LATAM/Spain engineering coordination, and Spanish AI quality evaluation)</w:t>
+        <w:t xml:space="preserve"> — Full professional fluency (DELE C1 Certified | 5 years professional experience across neutral international, Latin American, and Peninsular Spanish business/accounting registers, vendor coordination, and Spanish AI quality evaluation)</w:t>
       </w:r>
     </w:p>
     <w:p>
@@ -3621,7 +3365,7 @@
     </w:p>
     <w:p>
       <w:pPr>
-        <w:spacing w:before="0" w:after="60" w:line="276" w:lineRule="auto"/>
+        <w:spacing w:after="60" w:line="276" w:lineRule="auto"/>
         <w:ind w:left="274" w:hanging="187"/>
       </w:pPr>
       <w:r>
@@ -3652,12 +3396,12 @@
           <w:color w:val="000000"/>
           <w:sz w:val="20"/>
         </w:rPr>
-        <w:t xml:space="preserve"> based in Nairobi, Kenya (EAT / UTC+3) — eligible for immediate global remote engagement with natural overlap across Japan (JST), Europe/Spain, and U.S. hours.</w:t>
+        <w:t xml:space="preserve"> based in Nairobi, Kenya (EAT / UTC+3) — eligible for immediate global remote engagement with natural overlap across Japan (JST), Europe/Spain, and U.S. business hours.</w:t>
       </w:r>
     </w:p>
     <w:p>
       <w:pPr>
-        <w:spacing w:before="0" w:after="60" w:line="276" w:lineRule="auto"/>
+        <w:spacing w:after="60" w:line="276" w:lineRule="auto"/>
         <w:ind w:left="274" w:hanging="187"/>
       </w:pPr>
       <w:r>
@@ -3703,7 +3447,7 @@
     </w:p>
     <w:p>
       <w:pPr>
-        <w:spacing w:before="0" w:after="60" w:line="276" w:lineRule="auto"/>
+        <w:spacing w:after="60" w:line="276" w:lineRule="auto"/>
         <w:ind w:left="274" w:hanging="187"/>
       </w:pPr>
       <w:r>
@@ -3729,7 +3473,7 @@
     </w:p>
     <w:p>
       <w:pPr>
-        <w:spacing w:before="0" w:after="60" w:line="276" w:lineRule="auto"/>
+        <w:spacing w:after="60" w:line="276" w:lineRule="auto"/>
         <w:ind w:left="274" w:hanging="187"/>
       </w:pPr>
       <w:r>
@@ -3750,33 +3494,7 @@
           <w:color w:val="000000"/>
           <w:sz w:val="20"/>
         </w:rPr>
-        <w:t>Committed to incorporating reviewer feedback, aligning with evolving project guidelines, and upholding engineering and linguistic rigor.</w:t>
-      </w:r>
-    </w:p>
-    <w:p>
-      <w:pPr>
-        <w:spacing w:before="0" w:after="60" w:line="276" w:lineRule="auto"/>
-        <w:ind w:left="274" w:hanging="187"/>
-      </w:pPr>
-      <w:r>
-        <w:rPr>
-          <w:rFonts w:ascii="Arial" w:hAnsi="Arial" w:eastAsia="MS Gothic"/>
-          <w:b w:val="0"/>
-          <w:i w:val="0"/>
-          <w:color w:val="000000"/>
-          <w:sz w:val="20"/>
-        </w:rPr>
-        <w:t xml:space="preserve">•  </w:t>
-      </w:r>
-      <w:r>
-        <w:rPr>
-          <w:rFonts w:ascii="Arial" w:hAnsi="Arial" w:eastAsia="MS Gothic"/>
-          <w:b w:val="0"/>
-          <w:i w:val="0"/>
-          <w:color w:val="000000"/>
-          <w:sz w:val="20"/>
-        </w:rPr>
-        <w:t xml:space="preserve">Committed to completing all interviews and assessments </w:t>
+        <w:t xml:space="preserve">Committed to incorporating reviewer feedback, aligning with evolving project guidelines, and completing all assessments </w:t>
       </w:r>
       <w:r>
         <w:rPr>
@@ -3839,7 +3557,7 @@
         </w:trPr>
         <w:tc>
           <w:tcPr>
-            <w:tcW w:type="dxa" w:w="5544"/>
+            <w:tcW w:type="dxa" w:w="5832"/>
           </w:tcPr>
           <w:p>
             <w:pPr>
@@ -3860,7 +3578,7 @@
         </w:tc>
         <w:tc>
           <w:tcPr>
-            <w:tcW w:type="dxa" w:w="4766"/>
+            <w:tcW w:type="dxa" w:w="4478"/>
           </w:tcPr>
           <w:p>
             <w:pPr>
@@ -3876,7 +3594,7 @@
                 <w:color w:val="000000"/>
                 <w:sz w:val="19"/>
               </w:rPr>
-              <w:t>Engineering Director, Cloud Platform</w:t>
+              <w:t>Director of Operations &amp; Supply Chain Analytics</w:t>
             </w:r>
           </w:p>
         </w:tc>
@@ -3887,7 +3605,7 @@
         </w:trPr>
         <w:tc>
           <w:tcPr>
-            <w:tcW w:type="dxa" w:w="5544"/>
+            <w:tcW w:type="dxa" w:w="5832"/>
           </w:tcPr>
           <w:p>
             <w:pPr>
@@ -3902,13 +3620,13 @@
                 <w:color w:val="000000"/>
                 <w:sz w:val="19"/>
               </w:rPr>
-              <w:t>Fortune 100 Technology Company, San Francisco, CA, USA</w:t>
+              <w:t>Global Trade &amp; SMB Advisory Group (Referee Slot)</w:t>
             </w:r>
           </w:p>
         </w:tc>
         <w:tc>
           <w:tcPr>
-            <w:tcW w:type="dxa" w:w="4766"/>
+            <w:tcW w:type="dxa" w:w="4478"/>
           </w:tcPr>
           <w:p>
             <w:pPr>
@@ -4039,7 +3757,7 @@
         </w:trPr>
         <w:tc>
           <w:tcPr>
-            <w:tcW w:type="dxa" w:w="5544"/>
+            <w:tcW w:type="dxa" w:w="5832"/>
           </w:tcPr>
           <w:p>
             <w:pPr>
@@ -4060,7 +3778,7 @@
         </w:tc>
         <w:tc>
           <w:tcPr>
-            <w:tcW w:type="dxa" w:w="4766"/>
+            <w:tcW w:type="dxa" w:w="4478"/>
           </w:tcPr>
           <w:p>
             <w:pPr>
@@ -4076,7 +3794,7 @@
                 <w:color w:val="000000"/>
                 <w:sz w:val="19"/>
               </w:rPr>
-              <w:t>Senior Engineering Manager, Backend Systems</w:t>
+              <w:t>Head of Financial Analytics &amp; Accounting Systems</w:t>
             </w:r>
           </w:p>
         </w:tc>
@@ -4087,7 +3805,7 @@
         </w:trPr>
         <w:tc>
           <w:tcPr>
-            <w:tcW w:type="dxa" w:w="5544"/>
+            <w:tcW w:type="dxa" w:w="5832"/>
           </w:tcPr>
           <w:p>
             <w:pPr>
@@ -4102,13 +3820,13 @@
                 <w:color w:val="000000"/>
                 <w:sz w:val="19"/>
               </w:rPr>
-              <w:t>Top-Tier Consumer Technology Company, Seattle, WA, USA</w:t>
+              <w:t>Pacific Cross-Border Commerce Corp. (Referee Slot)</w:t>
             </w:r>
           </w:p>
         </w:tc>
         <w:tc>
           <w:tcPr>
-            <w:tcW w:type="dxa" w:w="4766"/>
+            <w:tcW w:type="dxa" w:w="4478"/>
           </w:tcPr>
           <w:p>
             <w:pPr>
@@ -4239,7 +3957,7 @@
         </w:trPr>
         <w:tc>
           <w:tcPr>
-            <w:tcW w:type="dxa" w:w="5544"/>
+            <w:tcW w:type="dxa" w:w="5832"/>
           </w:tcPr>
           <w:p>
             <w:pPr>
@@ -4260,7 +3978,7 @@
         </w:tc>
         <w:tc>
           <w:tcPr>
-            <w:tcW w:type="dxa" w:w="4766"/>
+            <w:tcW w:type="dxa" w:w="4478"/>
           </w:tcPr>
           <w:p>
             <w:pPr>
@@ -4276,7 +3994,7 @@
                 <w:color w:val="000000"/>
                 <w:sz w:val="19"/>
               </w:rPr>
-              <w:t>Professor of Computer Science &amp; Research Supervisor</w:t>
+              <w:t>Faculty Advisor — Management Science &amp; Analytics</w:t>
             </w:r>
           </w:p>
         </w:tc>
@@ -4287,7 +4005,7 @@
         </w:trPr>
         <w:tc>
           <w:tcPr>
-            <w:tcW w:type="dxa" w:w="5544"/>
+            <w:tcW w:type="dxa" w:w="5832"/>
           </w:tcPr>
           <w:p>
             <w:pPr>
@@ -4302,13 +4020,13 @@
                 <w:color w:val="000000"/>
                 <w:sz w:val="19"/>
               </w:rPr>
-              <w:t>Stanford University, Stanford, CA, USA</w:t>
+              <w:t>Stanford University, Stanford, CA (Referee Slot)</w:t>
             </w:r>
           </w:p>
         </w:tc>
         <w:tc>
           <w:tcPr>
-            <w:tcW w:type="dxa" w:w="4766"/>
+            <w:tcW w:type="dxa" w:w="4478"/>
           </w:tcPr>
           <w:p>
             <w:pPr>
@@ -4358,7 +4076,7 @@
                 <w:color w:val="000000"/>
                 <w:sz w:val="19"/>
               </w:rPr>
-              <w:t xml:space="preserve"> mtorres@stanford.edu  |  </w:t>
+              <w:t xml:space="preserve"> mtorres@example.edu  |  </w:t>
             </w:r>
             <w:r>
               <w:drawing>
@@ -4419,9 +4137,9 @@
           <w:b w:val="0"/>
           <w:i/>
           <w:color w:val="808080"/>
-          <w:sz w:val="19"/>
+          <w:sz w:val="18"/>
         </w:rPr>
-        <w:t>Additional references available upon request.</w:t>
+        <w:t>References available upon request (replace template contacts with consenting referees before submission).</w:t>
       </w:r>
     </w:p>
     <w:sectPr>

</xml_diff>

<commit_message>
Add executive referee layout preview (fictional sample names + LinkedIn/email/phone) in PDF & DOCX
Co-authored-by: arena-agent <297053741+arena-agent@users.noreply.github.com>
</commit_message>
<xml_diff>
--- a/Palmerrenae.docx
+++ b/Palmerrenae.docx
@@ -879,7 +879,7 @@
                 <w:color w:val="000000"/>
                 <w:sz w:val="20"/>
               </w:rPr>
-              <w:t xml:space="preserve">Master of Science in Management Science &amp; Analytics — </w:t>
+              <w:t xml:space="preserve">M.S. in Management Science &amp; Analytics — </w:t>
             </w:r>
             <w:r>
               <w:rPr>
@@ -1011,7 +1011,7 @@
                 <w:color w:val="000000"/>
                 <w:sz w:val="20"/>
               </w:rPr>
-              <w:t xml:space="preserve">Bachelor of Science in Business Data Analytics — </w:t>
+              <w:t xml:space="preserve">B.S. in Business Data Analytics — </w:t>
             </w:r>
             <w:r>
               <w:rPr>
@@ -1147,7 +1147,7 @@
         </w:trPr>
         <w:tc>
           <w:tcPr>
-            <w:tcW w:type="dxa" w:w="5832"/>
+            <w:tcW w:type="dxa" w:w="5256"/>
           </w:tcPr>
           <w:p>
             <w:pPr>
@@ -1178,7 +1178,7 @@
         </w:tc>
         <w:tc>
           <w:tcPr>
-            <w:tcW w:type="dxa" w:w="4478"/>
+            <w:tcW w:type="dxa" w:w="5054"/>
           </w:tcPr>
           <w:p>
             <w:pPr>
@@ -1205,7 +1205,7 @@
         </w:trPr>
         <w:tc>
           <w:tcPr>
-            <w:tcW w:type="dxa" w:w="5832"/>
+            <w:tcW w:type="dxa" w:w="5256"/>
           </w:tcPr>
           <w:p>
             <w:pPr>
@@ -1220,13 +1220,13 @@
                 <w:color w:val="000000"/>
                 <w:sz w:val="19"/>
               </w:rPr>
-              <w:t>Global Trade &amp; SMB Advisory Group — Remote (Nairobi, Kenya)</w:t>
+              <w:t>Global Trade &amp; SMB Advisory Group — Remote, Kenya</w:t>
             </w:r>
           </w:p>
         </w:tc>
         <w:tc>
           <w:tcPr>
-            <w:tcW w:type="dxa" w:w="4478"/>
+            <w:tcW w:type="dxa" w:w="5054"/>
           </w:tcPr>
           <w:p>
             <w:pPr>
@@ -1242,7 +1242,7 @@
                 <w:color w:val="000000"/>
                 <w:sz w:val="19"/>
               </w:rPr>
-              <w:t>QuickBooks AI • Xero • Zoho Books • Power BI • Excel • SQL</w:t>
+              <w:t>QuickBooks AI • Xero • Zoho Books • Power BI • Excel</w:t>
             </w:r>
           </w:p>
         </w:tc>
@@ -1435,7 +1435,7 @@
         </w:trPr>
         <w:tc>
           <w:tcPr>
-            <w:tcW w:type="dxa" w:w="5976"/>
+            <w:tcW w:type="dxa" w:w="5688"/>
           </w:tcPr>
           <w:p>
             <w:pPr>
@@ -1466,7 +1466,7 @@
         </w:tc>
         <w:tc>
           <w:tcPr>
-            <w:tcW w:type="dxa" w:w="4334"/>
+            <w:tcW w:type="dxa" w:w="4622"/>
           </w:tcPr>
           <w:p>
             <w:pPr>
@@ -1493,7 +1493,7 @@
         </w:trPr>
         <w:tc>
           <w:tcPr>
-            <w:tcW w:type="dxa" w:w="5976"/>
+            <w:tcW w:type="dxa" w:w="5688"/>
           </w:tcPr>
           <w:p>
             <w:pPr>
@@ -1508,13 +1508,13 @@
                 <w:color w:val="000000"/>
                 <w:sz w:val="19"/>
               </w:rPr>
-              <w:t>Pacific Cross-Border Commerce Corp., Seattle, WA, USA (OPT)</w:t>
+              <w:t>Pacific Cross-Border Commerce Corp., Seattle, WA (OPT)</w:t>
             </w:r>
           </w:p>
         </w:tc>
         <w:tc>
           <w:tcPr>
-            <w:tcW w:type="dxa" w:w="4334"/>
+            <w:tcW w:type="dxa" w:w="4622"/>
           </w:tcPr>
           <w:p>
             <w:pPr>
@@ -1530,7 +1530,7 @@
                 <w:color w:val="000000"/>
                 <w:sz w:val="19"/>
               </w:rPr>
-              <w:t>Tableau • Excel Power Query • SQL • QuickBooks • Xero</w:t>
+              <w:t>Tableau • Excel Power Query • SQL • QuickBooks</w:t>
             </w:r>
           </w:p>
         </w:tc>
@@ -1697,7 +1697,7 @@
         </w:trPr>
         <w:tc>
           <w:tcPr>
-            <w:tcW w:type="dxa" w:w="6120"/>
+            <w:tcW w:type="dxa" w:w="5472"/>
           </w:tcPr>
           <w:p>
             <w:pPr>
@@ -1728,7 +1728,7 @@
         </w:tc>
         <w:tc>
           <w:tcPr>
-            <w:tcW w:type="dxa" w:w="4190"/>
+            <w:tcW w:type="dxa" w:w="4838"/>
           </w:tcPr>
           <w:p>
             <w:pPr>
@@ -1755,7 +1755,7 @@
         </w:trPr>
         <w:tc>
           <w:tcPr>
-            <w:tcW w:type="dxa" w:w="6120"/>
+            <w:tcW w:type="dxa" w:w="5472"/>
           </w:tcPr>
           <w:p>
             <w:pPr>
@@ -1770,13 +1770,13 @@
                 <w:color w:val="000000"/>
                 <w:sz w:val="19"/>
               </w:rPr>
-              <w:t>Lone Star SMB Advisory Services, Austin, TX, USA (U.S. Post-Grad)</w:t>
+              <w:t>Lone Star SMB Advisory Services, Austin, TX (OPT)</w:t>
             </w:r>
           </w:p>
         </w:tc>
         <w:tc>
           <w:tcPr>
-            <w:tcW w:type="dxa" w:w="4190"/>
+            <w:tcW w:type="dxa" w:w="4838"/>
           </w:tcPr>
           <w:p>
             <w:pPr>
@@ -1792,7 +1792,7 @@
                 <w:color w:val="000000"/>
                 <w:sz w:val="19"/>
               </w:rPr>
-              <w:t>QuickBooks Online • Wave • Zoho Books • Excel • Data QA</w:t>
+              <w:t>QuickBooks Online • Wave • Zoho Books • Excel</w:t>
             </w:r>
           </w:p>
         </w:tc>
@@ -2126,18 +2126,8 @@
           </w:tcPr>
           <w:p>
             <w:pPr>
-              <w:spacing w:after="40"/>
+              <w:spacing w:after="50"/>
             </w:pPr>
-            <w:r>
-              <w:rPr>
-                <w:rFonts w:ascii="Arial" w:hAnsi="Arial" w:eastAsia="MS Gothic"/>
-                <w:b w:val="0"/>
-                <w:i w:val="0"/>
-                <w:color w:val="000000"/>
-                <w:sz w:val="19"/>
-              </w:rPr>
-              <w:t xml:space="preserve">•  </w:t>
-            </w:r>
             <w:r>
               <w:rPr>
                 <w:rFonts w:ascii="Arial" w:hAnsi="Arial" w:eastAsia="MS Gothic"/>
@@ -2146,7 +2136,7 @@
                 <w:color w:val="000000"/>
                 <w:sz w:val="19"/>
               </w:rPr>
-              <w:t xml:space="preserve">SME Accounting Software: </w:t>
+              <w:t xml:space="preserve">• SME Accounting Software: </w:t>
             </w:r>
             <w:r>
               <w:rPr>
@@ -2166,18 +2156,8 @@
           </w:tcPr>
           <w:p>
             <w:pPr>
-              <w:spacing w:after="40"/>
+              <w:spacing w:after="50"/>
             </w:pPr>
-            <w:r>
-              <w:rPr>
-                <w:rFonts w:ascii="Arial" w:hAnsi="Arial" w:eastAsia="MS Gothic"/>
-                <w:b w:val="0"/>
-                <w:i w:val="0"/>
-                <w:color w:val="000000"/>
-                <w:sz w:val="19"/>
-              </w:rPr>
-              <w:t xml:space="preserve">   •  </w:t>
-            </w:r>
             <w:r>
               <w:rPr>
                 <w:rFonts w:ascii="Arial" w:hAnsi="Arial" w:eastAsia="MS Gothic"/>
@@ -2186,7 +2166,7 @@
                 <w:color w:val="000000"/>
                 <w:sz w:val="19"/>
               </w:rPr>
-              <w:t xml:space="preserve">Logistics &amp; Supply Chain: </w:t>
+              <w:t xml:space="preserve">• Logistics &amp; Supply Chain: </w:t>
             </w:r>
             <w:r>
               <w:rPr>
@@ -2208,18 +2188,8 @@
           </w:tcPr>
           <w:p>
             <w:pPr>
-              <w:spacing w:after="40"/>
+              <w:spacing w:after="50"/>
             </w:pPr>
-            <w:r>
-              <w:rPr>
-                <w:rFonts w:ascii="Arial" w:hAnsi="Arial" w:eastAsia="MS Gothic"/>
-                <w:b w:val="0"/>
-                <w:i w:val="0"/>
-                <w:color w:val="000000"/>
-                <w:sz w:val="19"/>
-              </w:rPr>
-              <w:t xml:space="preserve">•  </w:t>
-            </w:r>
             <w:r>
               <w:rPr>
                 <w:rFonts w:ascii="Arial" w:hAnsi="Arial" w:eastAsia="MS Gothic"/>
@@ -2228,7 +2198,7 @@
                 <w:color w:val="000000"/>
                 <w:sz w:val="19"/>
               </w:rPr>
-              <w:t xml:space="preserve">AI Accounting Workflows: </w:t>
+              <w:t xml:space="preserve">• AI Accounting Workflows: </w:t>
             </w:r>
             <w:r>
               <w:rPr>
@@ -2248,18 +2218,8 @@
           </w:tcPr>
           <w:p>
             <w:pPr>
-              <w:spacing w:after="40"/>
+              <w:spacing w:after="50"/>
             </w:pPr>
-            <w:r>
-              <w:rPr>
-                <w:rFonts w:ascii="Arial" w:hAnsi="Arial" w:eastAsia="MS Gothic"/>
-                <w:b w:val="0"/>
-                <w:i w:val="0"/>
-                <w:color w:val="000000"/>
-                <w:sz w:val="19"/>
-              </w:rPr>
-              <w:t xml:space="preserve">   •  </w:t>
-            </w:r>
             <w:r>
               <w:rPr>
                 <w:rFonts w:ascii="Arial" w:hAnsi="Arial" w:eastAsia="MS Gothic"/>
@@ -2268,7 +2228,7 @@
                 <w:color w:val="000000"/>
                 <w:sz w:val="19"/>
               </w:rPr>
-              <w:t xml:space="preserve">Financial Operations: </w:t>
+              <w:t xml:space="preserve">• Financial Operations: </w:t>
             </w:r>
             <w:r>
               <w:rPr>
@@ -2290,18 +2250,8 @@
           </w:tcPr>
           <w:p>
             <w:pPr>
-              <w:spacing w:after="40"/>
+              <w:spacing w:after="50"/>
             </w:pPr>
-            <w:r>
-              <w:rPr>
-                <w:rFonts w:ascii="Arial" w:hAnsi="Arial" w:eastAsia="MS Gothic"/>
-                <w:b w:val="0"/>
-                <w:i w:val="0"/>
-                <w:color w:val="000000"/>
-                <w:sz w:val="19"/>
-              </w:rPr>
-              <w:t xml:space="preserve">•  </w:t>
-            </w:r>
             <w:r>
               <w:rPr>
                 <w:rFonts w:ascii="Arial" w:hAnsi="Arial" w:eastAsia="MS Gothic"/>
@@ -2310,7 +2260,7 @@
                 <w:color w:val="000000"/>
                 <w:sz w:val="19"/>
               </w:rPr>
-              <w:t xml:space="preserve">Data Analysis &amp; BI: </w:t>
+              <w:t xml:space="preserve">• Data Analysis &amp; BI: </w:t>
             </w:r>
             <w:r>
               <w:rPr>
@@ -2330,18 +2280,8 @@
           </w:tcPr>
           <w:p>
             <w:pPr>
-              <w:spacing w:after="40"/>
+              <w:spacing w:after="50"/>
             </w:pPr>
-            <w:r>
-              <w:rPr>
-                <w:rFonts w:ascii="Arial" w:hAnsi="Arial" w:eastAsia="MS Gothic"/>
-                <w:b w:val="0"/>
-                <w:i w:val="0"/>
-                <w:color w:val="000000"/>
-                <w:sz w:val="19"/>
-              </w:rPr>
-              <w:t xml:space="preserve">   •  </w:t>
-            </w:r>
             <w:r>
               <w:rPr>
                 <w:rFonts w:ascii="Arial" w:hAnsi="Arial" w:eastAsia="MS Gothic"/>
@@ -2350,7 +2290,7 @@
                 <w:color w:val="000000"/>
                 <w:sz w:val="19"/>
               </w:rPr>
-              <w:t xml:space="preserve">AI &amp; Productivity Tools: </w:t>
+              <w:t xml:space="preserve">• AI &amp; Productivity Tools: </w:t>
             </w:r>
             <w:r>
               <w:rPr>
@@ -2372,18 +2312,8 @@
           </w:tcPr>
           <w:p>
             <w:pPr>
-              <w:spacing w:after="40"/>
+              <w:spacing w:after="50"/>
             </w:pPr>
-            <w:r>
-              <w:rPr>
-                <w:rFonts w:ascii="Arial" w:hAnsi="Arial" w:eastAsia="MS Gothic"/>
-                <w:b w:val="0"/>
-                <w:i w:val="0"/>
-                <w:color w:val="000000"/>
-                <w:sz w:val="19"/>
-              </w:rPr>
-              <w:t xml:space="preserve">•  </w:t>
-            </w:r>
             <w:r>
               <w:rPr>
                 <w:rFonts w:ascii="Arial" w:hAnsi="Arial" w:eastAsia="MS Gothic"/>
@@ -2392,7 +2322,7 @@
                 <w:color w:val="000000"/>
                 <w:sz w:val="19"/>
               </w:rPr>
-              <w:t xml:space="preserve">Spoken Languages: </w:t>
+              <w:t xml:space="preserve">• Spoken Languages: </w:t>
             </w:r>
             <w:r>
               <w:rPr>
@@ -2412,18 +2342,8 @@
           </w:tcPr>
           <w:p>
             <w:pPr>
-              <w:spacing w:after="40"/>
+              <w:spacing w:after="50"/>
             </w:pPr>
-            <w:r>
-              <w:rPr>
-                <w:rFonts w:ascii="Arial" w:hAnsi="Arial" w:eastAsia="MS Gothic"/>
-                <w:b w:val="0"/>
-                <w:i w:val="0"/>
-                <w:color w:val="000000"/>
-                <w:sz w:val="19"/>
-              </w:rPr>
-              <w:t xml:space="preserve">   •  </w:t>
-            </w:r>
             <w:r>
               <w:rPr>
                 <w:rFonts w:ascii="Arial" w:hAnsi="Arial" w:eastAsia="MS Gothic"/>
@@ -2432,7 +2352,7 @@
                 <w:color w:val="000000"/>
                 <w:sz w:val="19"/>
               </w:rPr>
-              <w:t xml:space="preserve">Trade &amp; Localization: </w:t>
+              <w:t xml:space="preserve">• Trade &amp; Localization: </w:t>
             </w:r>
             <w:r>
               <w:rPr>
@@ -2926,7 +2846,7 @@
         </w:trPr>
         <w:tc>
           <w:tcPr>
-            <w:tcW w:type="dxa" w:w="6552"/>
+            <w:tcW w:type="dxa" w:w="6480"/>
           </w:tcPr>
           <w:p>
             <w:pPr>
@@ -2947,7 +2867,7 @@
         </w:tc>
         <w:tc>
           <w:tcPr>
-            <w:tcW w:type="dxa" w:w="3758"/>
+            <w:tcW w:type="dxa" w:w="3830"/>
           </w:tcPr>
           <w:p>
             <w:pPr>
@@ -2974,7 +2894,7 @@
         </w:trPr>
         <w:tc>
           <w:tcPr>
-            <w:tcW w:type="dxa" w:w="6552"/>
+            <w:tcW w:type="dxa" w:w="6480"/>
           </w:tcPr>
           <w:p>
             <w:pPr>
@@ -2995,7 +2915,7 @@
         </w:tc>
         <w:tc>
           <w:tcPr>
-            <w:tcW w:type="dxa" w:w="3758"/>
+            <w:tcW w:type="dxa" w:w="3830"/>
           </w:tcPr>
           <w:p>
             <w:pPr>
@@ -3100,7 +3020,7 @@
         </w:trPr>
         <w:tc>
           <w:tcPr>
-            <w:tcW w:type="dxa" w:w="6552"/>
+            <w:tcW w:type="dxa" w:w="6480"/>
           </w:tcPr>
           <w:p>
             <w:pPr>
@@ -3121,7 +3041,7 @@
         </w:tc>
         <w:tc>
           <w:tcPr>
-            <w:tcW w:type="dxa" w:w="3758"/>
+            <w:tcW w:type="dxa" w:w="3830"/>
           </w:tcPr>
           <w:p>
             <w:pPr>
@@ -3148,7 +3068,7 @@
         </w:trPr>
         <w:tc>
           <w:tcPr>
-            <w:tcW w:type="dxa" w:w="6552"/>
+            <w:tcW w:type="dxa" w:w="6480"/>
           </w:tcPr>
           <w:p>
             <w:pPr>
@@ -3169,7 +3089,7 @@
         </w:tc>
         <w:tc>
           <w:tcPr>
-            <w:tcW w:type="dxa" w:w="3758"/>
+            <w:tcW w:type="dxa" w:w="3830"/>
           </w:tcPr>
           <w:p>
             <w:pPr>
@@ -3259,7 +3179,7 @@
           <w:color w:val="000000"/>
           <w:sz w:val="20"/>
         </w:rPr>
-        <w:t>English &amp; Swahili</w:t>
+        <w:t xml:space="preserve">English &amp; Swahili — </w:t>
       </w:r>
       <w:r>
         <w:rPr>
@@ -3269,7 +3189,7 @@
           <w:color w:val="000000"/>
           <w:sz w:val="20"/>
         </w:rPr>
-        <w:t xml:space="preserve"> — Native proficiency (written &amp; spoken; executive business reporting, financial documentation &amp; stakeholder briefings)</w:t>
+        <w:t>Native proficiency (written &amp; spoken; executive business reporting, financial documentation &amp; stakeholder briefings)</w:t>
       </w:r>
     </w:p>
     <w:p>
@@ -3295,7 +3215,7 @@
           <w:color w:val="000000"/>
           <w:sz w:val="20"/>
         </w:rPr>
-        <w:t>Japanese (日本語)</w:t>
+        <w:t xml:space="preserve">Japanese (日本語) — </w:t>
       </w:r>
       <w:r>
         <w:rPr>
@@ -3305,7 +3225,7 @@
           <w:color w:val="000000"/>
           <w:sz w:val="20"/>
         </w:rPr>
-        <w:t xml:space="preserve"> — Full professional &amp; business fluency (JLPT N1 Certified | 5 years professional experience in corporate keigo [尊敬語・謙譲語・丁寧語], Japanese supplier/logistics coordination, invoice &amp; trade translation, and Japanese AI business prompt evaluation)</w:t>
+        <w:t>Full professional &amp; business fluency (JLPT N1 Certified | 5 years professional experience in corporate keigo [尊敬語・謙譲語・丁寧語], Japanese supplier/logistics coordination, invoice &amp; trade translation, and Japanese AI business prompt evaluation)</w:t>
       </w:r>
     </w:p>
     <w:p>
@@ -3331,7 +3251,7 @@
           <w:color w:val="000000"/>
           <w:sz w:val="20"/>
         </w:rPr>
-        <w:t>Spanish (Español)</w:t>
+        <w:t xml:space="preserve">Spanish (Español) — </w:t>
       </w:r>
       <w:r>
         <w:rPr>
@@ -3341,7 +3261,7 @@
           <w:color w:val="000000"/>
           <w:sz w:val="20"/>
         </w:rPr>
-        <w:t xml:space="preserve"> — Full professional fluency (DELE C1 Certified | 5 years professional experience across neutral international, Latin American, and Peninsular Spanish business/accounting registers, vendor coordination, and Spanish AI quality evaluation)</w:t>
+        <w:t>Full professional fluency (DELE C1 Certified | 5 years professional experience across neutral international, Latin American, and Peninsular Spanish business/accounting registers, vendor coordination, and Spanish AI quality evaluation)</w:t>
       </w:r>
     </w:p>
     <w:p>
@@ -3557,7 +3477,7 @@
         </w:trPr>
         <w:tc>
           <w:tcPr>
-            <w:tcW w:type="dxa" w:w="5832"/>
+            <w:tcW w:type="dxa" w:w="3528"/>
           </w:tcPr>
           <w:p>
             <w:pPr>
@@ -3572,13 +3492,23 @@
                 <w:color w:val="000000"/>
                 <w:sz w:val="20"/>
               </w:rPr>
-              <w:t>Lauren Chen</w:t>
+              <w:t>Alex Morgan</w:t>
+            </w:r>
+            <w:r>
+              <w:rPr>
+                <w:rFonts w:ascii="Arial" w:hAnsi="Arial" w:eastAsia="MS Gothic"/>
+                <w:b w:val="0"/>
+                <w:i w:val="0"/>
+                <w:color w:val="808080"/>
+                <w:sz w:val="17"/>
+              </w:rPr>
+              <w:t xml:space="preserve"> (Sample Preview)</w:t>
             </w:r>
           </w:p>
         </w:tc>
         <w:tc>
           <w:tcPr>
-            <w:tcW w:type="dxa" w:w="4478"/>
+            <w:tcW w:type="dxa" w:w="6782"/>
           </w:tcPr>
           <w:p>
             <w:pPr>
@@ -3594,7 +3524,7 @@
                 <w:color w:val="000000"/>
                 <w:sz w:val="19"/>
               </w:rPr>
-              <w:t>Director of Operations &amp; Supply Chain Analytics</w:t>
+              <w:t>Chief Business Development &amp; Operations Officer</w:t>
             </w:r>
           </w:p>
         </w:tc>
@@ -3605,7 +3535,7 @@
         </w:trPr>
         <w:tc>
           <w:tcPr>
-            <w:tcW w:type="dxa" w:w="5832"/>
+            <w:tcW w:type="dxa" w:w="3528"/>
           </w:tcPr>
           <w:p>
             <w:pPr>
@@ -3620,13 +3550,13 @@
                 <w:color w:val="000000"/>
                 <w:sz w:val="19"/>
               </w:rPr>
-              <w:t>Global Trade &amp; SMB Advisory Group (Referee Slot)</w:t>
+              <w:t>Northstar SMB Cloud (Sample)</w:t>
             </w:r>
           </w:p>
         </w:tc>
         <w:tc>
           <w:tcPr>
-            <w:tcW w:type="dxa" w:w="4478"/>
+            <w:tcW w:type="dxa" w:w="6782"/>
           </w:tcPr>
           <w:p>
             <w:pPr>
@@ -3637,7 +3567,7 @@
             <w:r>
               <w:drawing>
                 <wp:inline xmlns:a="http://schemas.openxmlformats.org/drawingml/2006/main" xmlns:pic="http://schemas.openxmlformats.org/drawingml/2006/picture">
-                  <wp:extent cx="105156" cy="105156"/>
+                  <wp:extent cx="100584" cy="100584"/>
                   <wp:docPr id="6" name="Picture 6"/>
                   <wp:cNvGraphicFramePr>
                     <a:graphicFrameLocks noChangeAspect="1"/>
@@ -3658,7 +3588,7 @@
                         <pic:spPr>
                           <a:xfrm>
                             <a:off x="0" y="0"/>
-                            <a:ext cx="105156" cy="105156"/>
+                            <a:ext cx="100584" cy="100584"/>
                           </a:xfrm>
                           <a:prstGeom prst="rect"/>
                         </pic:spPr>
@@ -3674,14 +3604,14 @@
                 <w:b w:val="0"/>
                 <w:i w:val="0"/>
                 <w:color w:val="000000"/>
-                <w:sz w:val="19"/>
+                <w:sz w:val="18"/>
               </w:rPr>
-              <w:t xml:space="preserve"> lauren.chen@example.com  |  </w:t>
+              <w:t xml:space="preserve"> a.morgan@example.com  |  </w:t>
             </w:r>
             <w:r>
               <w:drawing>
                 <wp:inline xmlns:a="http://schemas.openxmlformats.org/drawingml/2006/main" xmlns:pic="http://schemas.openxmlformats.org/drawingml/2006/picture">
-                  <wp:extent cx="105156" cy="105156"/>
+                  <wp:extent cx="100584" cy="100584"/>
                   <wp:docPr id="7" name="Picture 7"/>
                   <wp:cNvGraphicFramePr>
                     <a:graphicFrameLocks noChangeAspect="1"/>
@@ -3690,11 +3620,11 @@
                     <a:graphicData uri="http://schemas.openxmlformats.org/drawingml/2006/picture">
                       <pic:pic>
                         <pic:nvPicPr>
-                          <pic:cNvPr id="0" name="phone.png"/>
+                          <pic:cNvPr id="0" name="linkedin.png"/>
                           <pic:cNvPicPr/>
                         </pic:nvPicPr>
                         <pic:blipFill>
-                          <a:blip r:embed="rId17"/>
+                          <a:blip r:embed="rId12"/>
                           <a:stretch>
                             <a:fillRect/>
                           </a:stretch>
@@ -3702,7 +3632,7 @@
                         <pic:spPr>
                           <a:xfrm>
                             <a:off x="0" y="0"/>
-                            <a:ext cx="105156" cy="105156"/>
+                            <a:ext cx="100584" cy="100584"/>
                           </a:xfrm>
                           <a:prstGeom prst="rect"/>
                         </pic:spPr>
@@ -3718,9 +3648,73 @@
                 <w:b w:val="0"/>
                 <w:i w:val="0"/>
                 <w:color w:val="000000"/>
-                <w:sz w:val="19"/>
+                <w:sz w:val="18"/>
               </w:rPr>
-              <w:t xml:space="preserve"> +1 (415) 555 0142</w:t>
+              <w:t xml:space="preserve"> </w:t>
+            </w:r>
+            <w:hyperlink r:id="rId17">
+              <w:r>
+                <w:rPr>
+                  <w:rFonts w:ascii="Arial" w:hAnsi="Arial"/>
+                  <w:color w:val="2E6DA4"/>
+                  <w:sz w:val="18"/>
+                </w:rPr>
+                <w:t>linkedin.com/in/referee-1</w:t>
+              </w:r>
+            </w:hyperlink>
+            <w:r>
+              <w:rPr>
+                <w:rFonts w:ascii="Arial" w:hAnsi="Arial" w:eastAsia="MS Gothic"/>
+                <w:b w:val="0"/>
+                <w:i w:val="0"/>
+                <w:color w:val="000000"/>
+                <w:sz w:val="18"/>
+              </w:rPr>
+              <w:t xml:space="preserve">  |  </w:t>
+            </w:r>
+            <w:r>
+              <w:drawing>
+                <wp:inline xmlns:a="http://schemas.openxmlformats.org/drawingml/2006/main" xmlns:pic="http://schemas.openxmlformats.org/drawingml/2006/picture">
+                  <wp:extent cx="100584" cy="100584"/>
+                  <wp:docPr id="8" name="Picture 8"/>
+                  <wp:cNvGraphicFramePr>
+                    <a:graphicFrameLocks noChangeAspect="1"/>
+                  </wp:cNvGraphicFramePr>
+                  <a:graphic>
+                    <a:graphicData uri="http://schemas.openxmlformats.org/drawingml/2006/picture">
+                      <pic:pic>
+                        <pic:nvPicPr>
+                          <pic:cNvPr id="0" name="phone.png"/>
+                          <pic:cNvPicPr/>
+                        </pic:nvPicPr>
+                        <pic:blipFill>
+                          <a:blip r:embed="rId18"/>
+                          <a:stretch>
+                            <a:fillRect/>
+                          </a:stretch>
+                        </pic:blipFill>
+                        <pic:spPr>
+                          <a:xfrm>
+                            <a:off x="0" y="0"/>
+                            <a:ext cx="100584" cy="100584"/>
+                          </a:xfrm>
+                          <a:prstGeom prst="rect"/>
+                        </pic:spPr>
+                      </pic:pic>
+                    </a:graphicData>
+                  </a:graphic>
+                </wp:inline>
+              </w:drawing>
+            </w:r>
+            <w:r>
+              <w:rPr>
+                <w:rFonts w:ascii="Arial" w:hAnsi="Arial" w:eastAsia="MS Gothic"/>
+                <w:b w:val="0"/>
+                <w:i w:val="0"/>
+                <w:color w:val="000000"/>
+                <w:sz w:val="18"/>
+              </w:rPr>
+              <w:t xml:space="preserve"> +1 (415) 555-0142</w:t>
             </w:r>
           </w:p>
         </w:tc>
@@ -3757,7 +3751,7 @@
         </w:trPr>
         <w:tc>
           <w:tcPr>
-            <w:tcW w:type="dxa" w:w="5832"/>
+            <w:tcW w:type="dxa" w:w="3528"/>
           </w:tcPr>
           <w:p>
             <w:pPr>
@@ -3772,13 +3766,23 @@
                 <w:color w:val="000000"/>
                 <w:sz w:val="20"/>
               </w:rPr>
-              <w:t>Raj Patel</w:t>
+              <w:t>Taylor Brooks</w:t>
+            </w:r>
+            <w:r>
+              <w:rPr>
+                <w:rFonts w:ascii="Arial" w:hAnsi="Arial" w:eastAsia="MS Gothic"/>
+                <w:b w:val="0"/>
+                <w:i w:val="0"/>
+                <w:color w:val="808080"/>
+                <w:sz w:val="17"/>
+              </w:rPr>
+              <w:t xml:space="preserve"> (Sample Preview)</w:t>
             </w:r>
           </w:p>
         </w:tc>
         <w:tc>
           <w:tcPr>
-            <w:tcW w:type="dxa" w:w="4478"/>
+            <w:tcW w:type="dxa" w:w="6782"/>
           </w:tcPr>
           <w:p>
             <w:pPr>
@@ -3794,7 +3798,7 @@
                 <w:color w:val="000000"/>
                 <w:sz w:val="19"/>
               </w:rPr>
-              <w:t>Head of Financial Analytics &amp; Accounting Systems</w:t>
+              <w:t>Co-Founder &amp; Former Chief Product Officer</w:t>
             </w:r>
           </w:p>
         </w:tc>
@@ -3805,7 +3809,7 @@
         </w:trPr>
         <w:tc>
           <w:tcPr>
-            <w:tcW w:type="dxa" w:w="5832"/>
+            <w:tcW w:type="dxa" w:w="3528"/>
           </w:tcPr>
           <w:p>
             <w:pPr>
@@ -3820,13 +3824,13 @@
                 <w:color w:val="000000"/>
                 <w:sz w:val="19"/>
               </w:rPr>
-              <w:t>Pacific Cross-Border Commerce Corp. (Referee Slot)</w:t>
+              <w:t>Harborline Commerce (Sample)</w:t>
             </w:r>
           </w:p>
         </w:tc>
         <w:tc>
           <w:tcPr>
-            <w:tcW w:type="dxa" w:w="4478"/>
+            <w:tcW w:type="dxa" w:w="6782"/>
           </w:tcPr>
           <w:p>
             <w:pPr>
@@ -3837,8 +3841,8 @@
             <w:r>
               <w:drawing>
                 <wp:inline xmlns:a="http://schemas.openxmlformats.org/drawingml/2006/main" xmlns:pic="http://schemas.openxmlformats.org/drawingml/2006/picture">
-                  <wp:extent cx="105156" cy="105156"/>
-                  <wp:docPr id="8" name="Picture 8"/>
+                  <wp:extent cx="100584" cy="100584"/>
+                  <wp:docPr id="9" name="Picture 9"/>
                   <wp:cNvGraphicFramePr>
                     <a:graphicFrameLocks noChangeAspect="1"/>
                   </wp:cNvGraphicFramePr>
@@ -3858,7 +3862,7 @@
                         <pic:spPr>
                           <a:xfrm>
                             <a:off x="0" y="0"/>
-                            <a:ext cx="105156" cy="105156"/>
+                            <a:ext cx="100584" cy="100584"/>
                           </a:xfrm>
                           <a:prstGeom prst="rect"/>
                         </pic:spPr>
@@ -3874,15 +3878,15 @@
                 <w:b w:val="0"/>
                 <w:i w:val="0"/>
                 <w:color w:val="000000"/>
-                <w:sz w:val="19"/>
+                <w:sz w:val="18"/>
               </w:rPr>
-              <w:t xml:space="preserve"> raj.patel@example.com  |  </w:t>
+              <w:t xml:space="preserve"> t.brooks@example.com  |  </w:t>
             </w:r>
             <w:r>
               <w:drawing>
                 <wp:inline xmlns:a="http://schemas.openxmlformats.org/drawingml/2006/main" xmlns:pic="http://schemas.openxmlformats.org/drawingml/2006/picture">
-                  <wp:extent cx="105156" cy="105156"/>
-                  <wp:docPr id="9" name="Picture 9"/>
+                  <wp:extent cx="100584" cy="100584"/>
+                  <wp:docPr id="10" name="Picture 10"/>
                   <wp:cNvGraphicFramePr>
                     <a:graphicFrameLocks noChangeAspect="1"/>
                   </wp:cNvGraphicFramePr>
@@ -3890,11 +3894,11 @@
                     <a:graphicData uri="http://schemas.openxmlformats.org/drawingml/2006/picture">
                       <pic:pic>
                         <pic:nvPicPr>
-                          <pic:cNvPr id="0" name="phone.png"/>
+                          <pic:cNvPr id="0" name="linkedin.png"/>
                           <pic:cNvPicPr/>
                         </pic:nvPicPr>
                         <pic:blipFill>
-                          <a:blip r:embed="rId17"/>
+                          <a:blip r:embed="rId12"/>
                           <a:stretch>
                             <a:fillRect/>
                           </a:stretch>
@@ -3902,7 +3906,7 @@
                         <pic:spPr>
                           <a:xfrm>
                             <a:off x="0" y="0"/>
-                            <a:ext cx="105156" cy="105156"/>
+                            <a:ext cx="100584" cy="100584"/>
                           </a:xfrm>
                           <a:prstGeom prst="rect"/>
                         </pic:spPr>
@@ -3918,9 +3922,73 @@
                 <w:b w:val="0"/>
                 <w:i w:val="0"/>
                 <w:color w:val="000000"/>
-                <w:sz w:val="19"/>
+                <w:sz w:val="18"/>
               </w:rPr>
-              <w:t xml:space="preserve"> +1 (206) 555 0187</w:t>
+              <w:t xml:space="preserve"> </w:t>
+            </w:r>
+            <w:hyperlink r:id="rId17">
+              <w:r>
+                <w:rPr>
+                  <w:rFonts w:ascii="Arial" w:hAnsi="Arial"/>
+                  <w:color w:val="2E6DA4"/>
+                  <w:sz w:val="18"/>
+                </w:rPr>
+                <w:t>linkedin.com/in/referee-2</w:t>
+              </w:r>
+            </w:hyperlink>
+            <w:r>
+              <w:rPr>
+                <w:rFonts w:ascii="Arial" w:hAnsi="Arial" w:eastAsia="MS Gothic"/>
+                <w:b w:val="0"/>
+                <w:i w:val="0"/>
+                <w:color w:val="000000"/>
+                <w:sz w:val="18"/>
+              </w:rPr>
+              <w:t xml:space="preserve">  |  </w:t>
+            </w:r>
+            <w:r>
+              <w:drawing>
+                <wp:inline xmlns:a="http://schemas.openxmlformats.org/drawingml/2006/main" xmlns:pic="http://schemas.openxmlformats.org/drawingml/2006/picture">
+                  <wp:extent cx="100584" cy="100584"/>
+                  <wp:docPr id="11" name="Picture 11"/>
+                  <wp:cNvGraphicFramePr>
+                    <a:graphicFrameLocks noChangeAspect="1"/>
+                  </wp:cNvGraphicFramePr>
+                  <a:graphic>
+                    <a:graphicData uri="http://schemas.openxmlformats.org/drawingml/2006/picture">
+                      <pic:pic>
+                        <pic:nvPicPr>
+                          <pic:cNvPr id="0" name="phone.png"/>
+                          <pic:cNvPicPr/>
+                        </pic:nvPicPr>
+                        <pic:blipFill>
+                          <a:blip r:embed="rId18"/>
+                          <a:stretch>
+                            <a:fillRect/>
+                          </a:stretch>
+                        </pic:blipFill>
+                        <pic:spPr>
+                          <a:xfrm>
+                            <a:off x="0" y="0"/>
+                            <a:ext cx="100584" cy="100584"/>
+                          </a:xfrm>
+                          <a:prstGeom prst="rect"/>
+                        </pic:spPr>
+                      </pic:pic>
+                    </a:graphicData>
+                  </a:graphic>
+                </wp:inline>
+              </w:drawing>
+            </w:r>
+            <w:r>
+              <w:rPr>
+                <w:rFonts w:ascii="Arial" w:hAnsi="Arial" w:eastAsia="MS Gothic"/>
+                <w:b w:val="0"/>
+                <w:i w:val="0"/>
+                <w:color w:val="000000"/>
+                <w:sz w:val="18"/>
+              </w:rPr>
+              <w:t xml:space="preserve"> +1 (206) 555-0187</w:t>
             </w:r>
           </w:p>
         </w:tc>
@@ -3957,7 +4025,7 @@
         </w:trPr>
         <w:tc>
           <w:tcPr>
-            <w:tcW w:type="dxa" w:w="5832"/>
+            <w:tcW w:type="dxa" w:w="3528"/>
           </w:tcPr>
           <w:p>
             <w:pPr>
@@ -3972,13 +4040,23 @@
                 <w:color w:val="000000"/>
                 <w:sz w:val="20"/>
               </w:rPr>
-              <w:t>Prof. Michael Torres</w:t>
+              <w:t>Jordan Ellis</w:t>
+            </w:r>
+            <w:r>
+              <w:rPr>
+                <w:rFonts w:ascii="Arial" w:hAnsi="Arial" w:eastAsia="MS Gothic"/>
+                <w:b w:val="0"/>
+                <w:i w:val="0"/>
+                <w:color w:val="808080"/>
+                <w:sz w:val="17"/>
+              </w:rPr>
+              <w:t xml:space="preserve"> (Sample Preview)</w:t>
             </w:r>
           </w:p>
         </w:tc>
         <w:tc>
           <w:tcPr>
-            <w:tcW w:type="dxa" w:w="4478"/>
+            <w:tcW w:type="dxa" w:w="6782"/>
           </w:tcPr>
           <w:p>
             <w:pPr>
@@ -3994,7 +4072,7 @@
                 <w:color w:val="000000"/>
                 <w:sz w:val="19"/>
               </w:rPr>
-              <w:t>Faculty Advisor — Management Science &amp; Analytics</w:t>
+              <w:t>Co-Founder &amp; Former Chief Technology Officer</w:t>
             </w:r>
           </w:p>
         </w:tc>
@@ -4005,7 +4083,7 @@
         </w:trPr>
         <w:tc>
           <w:tcPr>
-            <w:tcW w:type="dxa" w:w="5832"/>
+            <w:tcW w:type="dxa" w:w="3528"/>
           </w:tcPr>
           <w:p>
             <w:pPr>
@@ -4020,13 +4098,13 @@
                 <w:color w:val="000000"/>
                 <w:sz w:val="19"/>
               </w:rPr>
-              <w:t>Stanford University, Stanford, CA (Referee Slot)</w:t>
+              <w:t>Meridian Operations (Sample)</w:t>
             </w:r>
           </w:p>
         </w:tc>
         <w:tc>
           <w:tcPr>
-            <w:tcW w:type="dxa" w:w="4478"/>
+            <w:tcW w:type="dxa" w:w="6782"/>
           </w:tcPr>
           <w:p>
             <w:pPr>
@@ -4037,8 +4115,8 @@
             <w:r>
               <w:drawing>
                 <wp:inline xmlns:a="http://schemas.openxmlformats.org/drawingml/2006/main" xmlns:pic="http://schemas.openxmlformats.org/drawingml/2006/picture">
-                  <wp:extent cx="105156" cy="105156"/>
-                  <wp:docPr id="10" name="Picture 10"/>
+                  <wp:extent cx="100584" cy="100584"/>
+                  <wp:docPr id="12" name="Picture 12"/>
                   <wp:cNvGraphicFramePr>
                     <a:graphicFrameLocks noChangeAspect="1"/>
                   </wp:cNvGraphicFramePr>
@@ -4058,7 +4136,7 @@
                         <pic:spPr>
                           <a:xfrm>
                             <a:off x="0" y="0"/>
-                            <a:ext cx="105156" cy="105156"/>
+                            <a:ext cx="100584" cy="100584"/>
                           </a:xfrm>
                           <a:prstGeom prst="rect"/>
                         </pic:spPr>
@@ -4074,15 +4152,15 @@
                 <w:b w:val="0"/>
                 <w:i w:val="0"/>
                 <w:color w:val="000000"/>
-                <w:sz w:val="19"/>
+                <w:sz w:val="18"/>
               </w:rPr>
-              <w:t xml:space="preserve"> mtorres@example.edu  |  </w:t>
+              <w:t xml:space="preserve"> j.ellis@example.com  |  </w:t>
             </w:r>
             <w:r>
               <w:drawing>
                 <wp:inline xmlns:a="http://schemas.openxmlformats.org/drawingml/2006/main" xmlns:pic="http://schemas.openxmlformats.org/drawingml/2006/picture">
-                  <wp:extent cx="105156" cy="105156"/>
-                  <wp:docPr id="11" name="Picture 11"/>
+                  <wp:extent cx="100584" cy="100584"/>
+                  <wp:docPr id="13" name="Picture 13"/>
                   <wp:cNvGraphicFramePr>
                     <a:graphicFrameLocks noChangeAspect="1"/>
                   </wp:cNvGraphicFramePr>
@@ -4090,11 +4168,11 @@
                     <a:graphicData uri="http://schemas.openxmlformats.org/drawingml/2006/picture">
                       <pic:pic>
                         <pic:nvPicPr>
-                          <pic:cNvPr id="0" name="phone.png"/>
+                          <pic:cNvPr id="0" name="linkedin.png"/>
                           <pic:cNvPicPr/>
                         </pic:nvPicPr>
                         <pic:blipFill>
-                          <a:blip r:embed="rId17"/>
+                          <a:blip r:embed="rId12"/>
                           <a:stretch>
                             <a:fillRect/>
                           </a:stretch>
@@ -4102,7 +4180,7 @@
                         <pic:spPr>
                           <a:xfrm>
                             <a:off x="0" y="0"/>
-                            <a:ext cx="105156" cy="105156"/>
+                            <a:ext cx="100584" cy="100584"/>
                           </a:xfrm>
                           <a:prstGeom prst="rect"/>
                         </pic:spPr>
@@ -4118,9 +4196,73 @@
                 <w:b w:val="0"/>
                 <w:i w:val="0"/>
                 <w:color w:val="000000"/>
-                <w:sz w:val="19"/>
+                <w:sz w:val="18"/>
               </w:rPr>
-              <w:t xml:space="preserve"> +1 (650) 555 0219</w:t>
+              <w:t xml:space="preserve"> </w:t>
+            </w:r>
+            <w:hyperlink r:id="rId17">
+              <w:r>
+                <w:rPr>
+                  <w:rFonts w:ascii="Arial" w:hAnsi="Arial"/>
+                  <w:color w:val="2E6DA4"/>
+                  <w:sz w:val="18"/>
+                </w:rPr>
+                <w:t>linkedin.com/in/referee-3</w:t>
+              </w:r>
+            </w:hyperlink>
+            <w:r>
+              <w:rPr>
+                <w:rFonts w:ascii="Arial" w:hAnsi="Arial" w:eastAsia="MS Gothic"/>
+                <w:b w:val="0"/>
+                <w:i w:val="0"/>
+                <w:color w:val="000000"/>
+                <w:sz w:val="18"/>
+              </w:rPr>
+              <w:t xml:space="preserve">  |  </w:t>
+            </w:r>
+            <w:r>
+              <w:drawing>
+                <wp:inline xmlns:a="http://schemas.openxmlformats.org/drawingml/2006/main" xmlns:pic="http://schemas.openxmlformats.org/drawingml/2006/picture">
+                  <wp:extent cx="100584" cy="100584"/>
+                  <wp:docPr id="14" name="Picture 14"/>
+                  <wp:cNvGraphicFramePr>
+                    <a:graphicFrameLocks noChangeAspect="1"/>
+                  </wp:cNvGraphicFramePr>
+                  <a:graphic>
+                    <a:graphicData uri="http://schemas.openxmlformats.org/drawingml/2006/picture">
+                      <pic:pic>
+                        <pic:nvPicPr>
+                          <pic:cNvPr id="0" name="phone.png"/>
+                          <pic:cNvPicPr/>
+                        </pic:nvPicPr>
+                        <pic:blipFill>
+                          <a:blip r:embed="rId18"/>
+                          <a:stretch>
+                            <a:fillRect/>
+                          </a:stretch>
+                        </pic:blipFill>
+                        <pic:spPr>
+                          <a:xfrm>
+                            <a:off x="0" y="0"/>
+                            <a:ext cx="100584" cy="100584"/>
+                          </a:xfrm>
+                          <a:prstGeom prst="rect"/>
+                        </pic:spPr>
+                      </pic:pic>
+                    </a:graphicData>
+                  </a:graphic>
+                </wp:inline>
+              </w:drawing>
+            </w:r>
+            <w:r>
+              <w:rPr>
+                <w:rFonts w:ascii="Arial" w:hAnsi="Arial" w:eastAsia="MS Gothic"/>
+                <w:b w:val="0"/>
+                <w:i w:val="0"/>
+                <w:color w:val="000000"/>
+                <w:sz w:val="18"/>
+              </w:rPr>
+              <w:t xml:space="preserve"> +1 (650) 555-0219</w:t>
             </w:r>
           </w:p>
         </w:tc>
@@ -4139,7 +4281,7 @@
           <w:color w:val="808080"/>
           <w:sz w:val="18"/>
         </w:rPr>
-        <w:t>References available upon request (replace template contacts with consenting referees before submission).</w:t>
+        <w:t>Fictional sample executive entries shown for layout preview — replace with consenting referees before submission.</w:t>
       </w:r>
     </w:p>
     <w:sectPr>

</xml_diff>